<commit_message>
Save project cleanup changes
</commit_message>
<xml_diff>
--- a/docs/Enterprise Kubernetes Security Platform on Amazon EKS.docx
+++ b/docs/Enterprise Kubernetes Security Platform on Amazon EKS.docx
@@ -851,16 +851,7 @@
           <w:bCs/>
           <w:color w:val="0000FF"/>
         </w:rPr>
-        <w:t xml:space="preserve"> k8s scripts docs images </w:t>
-      </w:r>
-      <w:proofErr w:type="gramStart"/>
-      <w:r>
-        <w:rPr>
-          <w:b/>
-          <w:bCs/>
-          <w:color w:val="0000FF"/>
-        </w:rPr>
-        <w:t>reports .</w:t>
+        <w:t xml:space="preserve"> k8s scripts docs images reports .</w:t>
       </w:r>
       <w:proofErr w:type="spellStart"/>
       <w:r>
@@ -872,7 +863,6 @@
         <w:t>github</w:t>
       </w:r>
       <w:proofErr w:type="spellEnd"/>
-      <w:proofErr w:type="gramEnd"/>
       <w:r>
         <w:rPr>
           <w:b/>
@@ -931,18 +921,8 @@
           <w:bCs/>
           <w:color w:val="0000FF"/>
         </w:rPr>
-        <w:t xml:space="preserve">cd </w:t>
-      </w:r>
-      <w:proofErr w:type="gramStart"/>
-      <w:r>
-        <w:rPr>
-          <w:b/>
-          <w:bCs/>
-          <w:color w:val="0000FF"/>
-        </w:rPr>
-        <w:t>terraform</w:t>
-      </w:r>
-      <w:proofErr w:type="gramEnd"/>
+        <w:t>cd terraform</w:t>
+      </w:r>
     </w:p>
     <w:p>
       <w:r>
@@ -1001,7 +981,6 @@
         <w:t xml:space="preserve">touch provider.tf variables.tf </w:t>
       </w:r>
       <w:proofErr w:type="spellStart"/>
-      <w:proofErr w:type="gramStart"/>
       <w:r>
         <w:rPr>
           <w:b/>
@@ -1011,7 +990,6 @@
         <w:t>terraform.tfvars</w:t>
       </w:r>
       <w:proofErr w:type="spellEnd"/>
-      <w:proofErr w:type="gramEnd"/>
       <w:r>
         <w:rPr>
           <w:b/>
@@ -1222,25 +1200,7 @@
           <w:bCs/>
           <w:color w:val="0000FF"/>
         </w:rPr>
-        <w:t xml:space="preserve">      </w:t>
-      </w:r>
-      <w:proofErr w:type="gramStart"/>
-      <w:r>
-        <w:rPr>
-          <w:b/>
-          <w:bCs/>
-          <w:color w:val="0000FF"/>
-        </w:rPr>
-        <w:t>source  =</w:t>
-      </w:r>
-      <w:proofErr w:type="gramEnd"/>
-      <w:r>
-        <w:rPr>
-          <w:b/>
-          <w:bCs/>
-          <w:color w:val="0000FF"/>
-        </w:rPr>
-        <w:t xml:space="preserve"> "</w:t>
+        <w:t xml:space="preserve">      source  = "</w:t>
       </w:r>
       <w:proofErr w:type="spellStart"/>
       <w:r>
@@ -2584,25 +2544,7 @@
           <w:bCs/>
           <w:color w:val="0000FF"/>
         </w:rPr>
-        <w:t xml:space="preserve">  default     = "t</w:t>
-      </w:r>
-      <w:proofErr w:type="gramStart"/>
-      <w:r>
-        <w:rPr>
-          <w:b/>
-          <w:bCs/>
-          <w:color w:val="0000FF"/>
-        </w:rPr>
-        <w:t>3.medium</w:t>
-      </w:r>
-      <w:proofErr w:type="gramEnd"/>
-      <w:r>
-        <w:rPr>
-          <w:b/>
-          <w:bCs/>
-          <w:color w:val="0000FF"/>
-        </w:rPr>
-        <w:t>"</w:t>
+        <w:t xml:space="preserve">  default     = "t3.medium"</w:t>
       </w:r>
     </w:p>
     <w:p>
@@ -2761,12 +2703,10 @@
         <w:t xml:space="preserve"> Modify </w:t>
       </w:r>
       <w:proofErr w:type="spellStart"/>
-      <w:proofErr w:type="gramStart"/>
       <w:r>
         <w:t>terraform.tfvars</w:t>
       </w:r>
       <w:proofErr w:type="spellEnd"/>
-      <w:proofErr w:type="gramEnd"/>
     </w:p>
     <w:p>
       <w:pPr>
@@ -2785,7 +2725,6 @@
         <w:t xml:space="preserve">Paste the Terraform code:   </w:t>
       </w:r>
       <w:proofErr w:type="spellStart"/>
-      <w:proofErr w:type="gramStart"/>
       <w:r>
         <w:rPr>
           <w:b/>
@@ -2795,7 +2734,6 @@
         <w:t>terraform.tfvars</w:t>
       </w:r>
       <w:proofErr w:type="spellEnd"/>
-      <w:proofErr w:type="gramEnd"/>
     </w:p>
     <w:p>
       <w:pPr>
@@ -3010,34 +2948,16 @@
           <w:bCs/>
           <w:color w:val="0000FF"/>
         </w:rPr>
-        <w:t>public_subnet_</w:t>
-      </w:r>
-      <w:proofErr w:type="gramStart"/>
-      <w:r>
-        <w:rPr>
-          <w:b/>
-          <w:bCs/>
-          <w:color w:val="0000FF"/>
-        </w:rPr>
-        <w:t>cidrs</w:t>
-      </w:r>
-      <w:proofErr w:type="spellEnd"/>
-      <w:r>
-        <w:rPr>
-          <w:b/>
-          <w:bCs/>
-          <w:color w:val="0000FF"/>
-        </w:rPr>
-        <w:t xml:space="preserve">  =</w:t>
-      </w:r>
-      <w:proofErr w:type="gramEnd"/>
-      <w:r>
-        <w:rPr>
-          <w:b/>
-          <w:bCs/>
-          <w:color w:val="0000FF"/>
-        </w:rPr>
-        <w:t xml:space="preserve"> ["10.0.1.0/24", "10.0.2.0/24"]</w:t>
+        <w:t>public_subnet_cidrs</w:t>
+      </w:r>
+      <w:proofErr w:type="spellEnd"/>
+      <w:r>
+        <w:rPr>
+          <w:b/>
+          <w:bCs/>
+          <w:color w:val="0000FF"/>
+        </w:rPr>
+        <w:t xml:space="preserve">  = ["10.0.1.0/24", "10.0.2.0/24"]</w:t>
       </w:r>
     </w:p>
     <w:p>
@@ -3121,25 +3041,7 @@
           <w:bCs/>
           <w:color w:val="0000FF"/>
         </w:rPr>
-        <w:t xml:space="preserve">   = "t</w:t>
-      </w:r>
-      <w:proofErr w:type="gramStart"/>
-      <w:r>
-        <w:rPr>
-          <w:b/>
-          <w:bCs/>
-          <w:color w:val="0000FF"/>
-        </w:rPr>
-        <w:t>3.medium</w:t>
-      </w:r>
-      <w:proofErr w:type="gramEnd"/>
-      <w:r>
-        <w:rPr>
-          <w:b/>
-          <w:bCs/>
-          <w:color w:val="0000FF"/>
-        </w:rPr>
-        <w:t>"</w:t>
+        <w:t xml:space="preserve">   = "t3.medium"</w:t>
       </w:r>
     </w:p>
     <w:p>
@@ -3297,23 +3199,13 @@
         <w:t xml:space="preserve">    Project     = </w:t>
       </w:r>
       <w:proofErr w:type="spellStart"/>
-      <w:proofErr w:type="gramStart"/>
-      <w:r>
-        <w:rPr>
-          <w:b/>
-          <w:bCs/>
-          <w:color w:val="0000FF"/>
-        </w:rPr>
-        <w:t>var.project</w:t>
-      </w:r>
-      <w:proofErr w:type="gramEnd"/>
-      <w:r>
-        <w:rPr>
-          <w:b/>
-          <w:bCs/>
-          <w:color w:val="0000FF"/>
-        </w:rPr>
-        <w:t>_name</w:t>
+      <w:r>
+        <w:rPr>
+          <w:b/>
+          <w:bCs/>
+          <w:color w:val="0000FF"/>
+        </w:rPr>
+        <w:t>var.project_name</w:t>
       </w:r>
       <w:proofErr w:type="spellEnd"/>
     </w:p>
@@ -3596,34 +3488,16 @@
           <w:bCs/>
           <w:color w:val="0000FF"/>
         </w:rPr>
-        <w:t xml:space="preserve">  tags = </w:t>
-      </w:r>
-      <w:proofErr w:type="gramStart"/>
-      <w:r>
-        <w:rPr>
-          <w:b/>
-          <w:bCs/>
-          <w:color w:val="0000FF"/>
-        </w:rPr>
-        <w:t>merge(</w:t>
-      </w:r>
-      <w:proofErr w:type="spellStart"/>
-      <w:r>
-        <w:rPr>
-          <w:b/>
-          <w:bCs/>
-          <w:color w:val="0000FF"/>
-        </w:rPr>
-        <w:t>local.common</w:t>
-      </w:r>
-      <w:proofErr w:type="gramEnd"/>
-      <w:r>
-        <w:rPr>
-          <w:b/>
-          <w:bCs/>
-          <w:color w:val="0000FF"/>
-        </w:rPr>
-        <w:t>_tags</w:t>
+        <w:t xml:space="preserve">  tags = merge(</w:t>
+      </w:r>
+      <w:proofErr w:type="spellStart"/>
+      <w:r>
+        <w:rPr>
+          <w:b/>
+          <w:bCs/>
+          <w:color w:val="0000FF"/>
+        </w:rPr>
+        <w:t>local.common_tags</w:t>
       </w:r>
       <w:proofErr w:type="spellEnd"/>
       <w:r>
@@ -3653,23 +3527,13 @@
         <w:t xml:space="preserve">    Name = "${</w:t>
       </w:r>
       <w:proofErr w:type="spellStart"/>
-      <w:proofErr w:type="gramStart"/>
-      <w:r>
-        <w:rPr>
-          <w:b/>
-          <w:bCs/>
-          <w:color w:val="0000FF"/>
-        </w:rPr>
-        <w:t>var.project</w:t>
-      </w:r>
-      <w:proofErr w:type="gramEnd"/>
-      <w:r>
-        <w:rPr>
-          <w:b/>
-          <w:bCs/>
-          <w:color w:val="0000FF"/>
-        </w:rPr>
-        <w:t>_name</w:t>
+      <w:r>
+        <w:rPr>
+          <w:b/>
+          <w:bCs/>
+          <w:color w:val="0000FF"/>
+        </w:rPr>
+        <w:t>var.project_name</w:t>
       </w:r>
       <w:proofErr w:type="spellEnd"/>
       <w:r>
@@ -3843,34 +3707,16 @@
           <w:bCs/>
           <w:color w:val="0000FF"/>
         </w:rPr>
-        <w:t xml:space="preserve">  tags = </w:t>
-      </w:r>
-      <w:proofErr w:type="gramStart"/>
-      <w:r>
-        <w:rPr>
-          <w:b/>
-          <w:bCs/>
-          <w:color w:val="0000FF"/>
-        </w:rPr>
-        <w:t>merge(</w:t>
-      </w:r>
-      <w:proofErr w:type="spellStart"/>
-      <w:r>
-        <w:rPr>
-          <w:b/>
-          <w:bCs/>
-          <w:color w:val="0000FF"/>
-        </w:rPr>
-        <w:t>local.common</w:t>
-      </w:r>
-      <w:proofErr w:type="gramEnd"/>
-      <w:r>
-        <w:rPr>
-          <w:b/>
-          <w:bCs/>
-          <w:color w:val="0000FF"/>
-        </w:rPr>
-        <w:t>_tags</w:t>
+        <w:t xml:space="preserve">  tags = merge(</w:t>
+      </w:r>
+      <w:proofErr w:type="spellStart"/>
+      <w:r>
+        <w:rPr>
+          <w:b/>
+          <w:bCs/>
+          <w:color w:val="0000FF"/>
+        </w:rPr>
+        <w:t>local.common_tags</w:t>
       </w:r>
       <w:proofErr w:type="spellEnd"/>
       <w:r>
@@ -3900,23 +3746,13 @@
         <w:t xml:space="preserve">    Name = "${</w:t>
       </w:r>
       <w:proofErr w:type="spellStart"/>
-      <w:proofErr w:type="gramStart"/>
-      <w:r>
-        <w:rPr>
-          <w:b/>
-          <w:bCs/>
-          <w:color w:val="0000FF"/>
-        </w:rPr>
-        <w:t>var.project</w:t>
-      </w:r>
-      <w:proofErr w:type="gramEnd"/>
-      <w:r>
-        <w:rPr>
-          <w:b/>
-          <w:bCs/>
-          <w:color w:val="0000FF"/>
-        </w:rPr>
-        <w:t>_name</w:t>
+      <w:r>
+        <w:rPr>
+          <w:b/>
+          <w:bCs/>
+          <w:color w:val="0000FF"/>
+        </w:rPr>
+        <w:t>var.project_name</w:t>
       </w:r>
       <w:proofErr w:type="spellEnd"/>
       <w:r>
@@ -4046,23 +3882,13 @@
         <w:t xml:space="preserve">  count                   = length(</w:t>
       </w:r>
       <w:proofErr w:type="spellStart"/>
-      <w:proofErr w:type="gramStart"/>
-      <w:r>
-        <w:rPr>
-          <w:b/>
-          <w:bCs/>
-          <w:color w:val="0000FF"/>
-        </w:rPr>
-        <w:t>var.public</w:t>
-      </w:r>
-      <w:proofErr w:type="gramEnd"/>
-      <w:r>
-        <w:rPr>
-          <w:b/>
-          <w:bCs/>
-          <w:color w:val="0000FF"/>
-        </w:rPr>
-        <w:t>_subnet_cidrs</w:t>
+      <w:r>
+        <w:rPr>
+          <w:b/>
+          <w:bCs/>
+          <w:color w:val="0000FF"/>
+        </w:rPr>
+        <w:t>var.public_subnet_cidrs</w:t>
       </w:r>
       <w:proofErr w:type="spellEnd"/>
       <w:r>
@@ -4146,23 +3972,13 @@
         <w:t xml:space="preserve">              = </w:t>
       </w:r>
       <w:proofErr w:type="spellStart"/>
-      <w:proofErr w:type="gramStart"/>
-      <w:r>
-        <w:rPr>
-          <w:b/>
-          <w:bCs/>
-          <w:color w:val="0000FF"/>
-        </w:rPr>
-        <w:t>var.public</w:t>
-      </w:r>
-      <w:proofErr w:type="gramEnd"/>
-      <w:r>
-        <w:rPr>
-          <w:b/>
-          <w:bCs/>
-          <w:color w:val="0000FF"/>
-        </w:rPr>
-        <w:t>_subnet_cidrs</w:t>
+      <w:r>
+        <w:rPr>
+          <w:b/>
+          <w:bCs/>
+          <w:color w:val="0000FF"/>
+        </w:rPr>
+        <w:t>var.public_subnet_cidrs</w:t>
       </w:r>
       <w:proofErr w:type="spellEnd"/>
       <w:r>
@@ -4174,7 +3990,6 @@
         <w:t>[</w:t>
       </w:r>
       <w:proofErr w:type="spellStart"/>
-      <w:proofErr w:type="gramStart"/>
       <w:r>
         <w:rPr>
           <w:b/>
@@ -4184,7 +3999,6 @@
         <w:t>count.index</w:t>
       </w:r>
       <w:proofErr w:type="spellEnd"/>
-      <w:proofErr w:type="gramEnd"/>
       <w:r>
         <w:rPr>
           <w:b/>
@@ -4230,23 +4044,13 @@
         <w:t xml:space="preserve">       = </w:t>
       </w:r>
       <w:proofErr w:type="spellStart"/>
-      <w:proofErr w:type="gramStart"/>
-      <w:r>
-        <w:rPr>
-          <w:b/>
-          <w:bCs/>
-          <w:color w:val="0000FF"/>
-        </w:rPr>
-        <w:t>var.availability</w:t>
-      </w:r>
-      <w:proofErr w:type="gramEnd"/>
-      <w:r>
-        <w:rPr>
-          <w:b/>
-          <w:bCs/>
-          <w:color w:val="0000FF"/>
-        </w:rPr>
-        <w:t>_zones</w:t>
+      <w:r>
+        <w:rPr>
+          <w:b/>
+          <w:bCs/>
+          <w:color w:val="0000FF"/>
+        </w:rPr>
+        <w:t>var.availability_zones</w:t>
       </w:r>
       <w:proofErr w:type="spellEnd"/>
       <w:r>
@@ -4258,7 +4062,6 @@
         <w:t>[</w:t>
       </w:r>
       <w:proofErr w:type="spellStart"/>
-      <w:proofErr w:type="gramStart"/>
       <w:r>
         <w:rPr>
           <w:b/>
@@ -4268,7 +4071,6 @@
         <w:t>count.index</w:t>
       </w:r>
       <w:proofErr w:type="spellEnd"/>
-      <w:proofErr w:type="gramEnd"/>
       <w:r>
         <w:rPr>
           <w:b/>
@@ -4339,34 +4141,16 @@
           <w:bCs/>
           <w:color w:val="0000FF"/>
         </w:rPr>
-        <w:t xml:space="preserve">  tags = </w:t>
-      </w:r>
-      <w:proofErr w:type="gramStart"/>
-      <w:r>
-        <w:rPr>
-          <w:b/>
-          <w:bCs/>
-          <w:color w:val="0000FF"/>
-        </w:rPr>
-        <w:t>merge(</w:t>
-      </w:r>
-      <w:proofErr w:type="spellStart"/>
-      <w:r>
-        <w:rPr>
-          <w:b/>
-          <w:bCs/>
-          <w:color w:val="0000FF"/>
-        </w:rPr>
-        <w:t>local.common</w:t>
-      </w:r>
-      <w:proofErr w:type="gramEnd"/>
-      <w:r>
-        <w:rPr>
-          <w:b/>
-          <w:bCs/>
-          <w:color w:val="0000FF"/>
-        </w:rPr>
-        <w:t>_tags</w:t>
+        <w:t xml:space="preserve">  tags = merge(</w:t>
+      </w:r>
+      <w:proofErr w:type="spellStart"/>
+      <w:r>
+        <w:rPr>
+          <w:b/>
+          <w:bCs/>
+          <w:color w:val="0000FF"/>
+        </w:rPr>
+        <w:t>local.common_tags</w:t>
       </w:r>
       <w:proofErr w:type="spellEnd"/>
       <w:r>
@@ -4396,23 +4180,13 @@
         <w:t xml:space="preserve">    Name                     = "${</w:t>
       </w:r>
       <w:proofErr w:type="spellStart"/>
-      <w:proofErr w:type="gramStart"/>
-      <w:r>
-        <w:rPr>
-          <w:b/>
-          <w:bCs/>
-          <w:color w:val="0000FF"/>
-        </w:rPr>
-        <w:t>var.project</w:t>
-      </w:r>
-      <w:proofErr w:type="gramEnd"/>
-      <w:r>
-        <w:rPr>
-          <w:b/>
-          <w:bCs/>
-          <w:color w:val="0000FF"/>
-        </w:rPr>
-        <w:t>_name</w:t>
+      <w:r>
+        <w:rPr>
+          <w:b/>
+          <w:bCs/>
+          <w:color w:val="0000FF"/>
+        </w:rPr>
+        <w:t>var.project_name</w:t>
       </w:r>
       <w:proofErr w:type="spellEnd"/>
       <w:r>
@@ -4424,7 +4198,6 @@
         <w:t>}-public-${</w:t>
       </w:r>
       <w:proofErr w:type="spellStart"/>
-      <w:proofErr w:type="gramStart"/>
       <w:r>
         <w:rPr>
           <w:b/>
@@ -4434,7 +4207,6 @@
         <w:t>count.index</w:t>
       </w:r>
       <w:proofErr w:type="spellEnd"/>
-      <w:proofErr w:type="gramEnd"/>
       <w:r>
         <w:rPr>
           <w:b/>
@@ -4580,23 +4352,13 @@
         <w:t xml:space="preserve">  count             = length(</w:t>
       </w:r>
       <w:proofErr w:type="spellStart"/>
-      <w:proofErr w:type="gramStart"/>
-      <w:r>
-        <w:rPr>
-          <w:b/>
-          <w:bCs/>
-          <w:color w:val="0000FF"/>
-        </w:rPr>
-        <w:t>var.private</w:t>
-      </w:r>
-      <w:proofErr w:type="gramEnd"/>
-      <w:r>
-        <w:rPr>
-          <w:b/>
-          <w:bCs/>
-          <w:color w:val="0000FF"/>
-        </w:rPr>
-        <w:t>_subnet_cidrs</w:t>
+      <w:r>
+        <w:rPr>
+          <w:b/>
+          <w:bCs/>
+          <w:color w:val="0000FF"/>
+        </w:rPr>
+        <w:t>var.private_subnet_cidrs</w:t>
       </w:r>
       <w:proofErr w:type="spellEnd"/>
       <w:r>
@@ -4680,23 +4442,13 @@
         <w:t xml:space="preserve">        = </w:t>
       </w:r>
       <w:proofErr w:type="spellStart"/>
-      <w:proofErr w:type="gramStart"/>
-      <w:r>
-        <w:rPr>
-          <w:b/>
-          <w:bCs/>
-          <w:color w:val="0000FF"/>
-        </w:rPr>
-        <w:t>var.private</w:t>
-      </w:r>
-      <w:proofErr w:type="gramEnd"/>
-      <w:r>
-        <w:rPr>
-          <w:b/>
-          <w:bCs/>
-          <w:color w:val="0000FF"/>
-        </w:rPr>
-        <w:t>_subnet_cidrs</w:t>
+      <w:r>
+        <w:rPr>
+          <w:b/>
+          <w:bCs/>
+          <w:color w:val="0000FF"/>
+        </w:rPr>
+        <w:t>var.private_subnet_cidrs</w:t>
       </w:r>
       <w:proofErr w:type="spellEnd"/>
       <w:r>
@@ -4708,7 +4460,6 @@
         <w:t>[</w:t>
       </w:r>
       <w:proofErr w:type="spellStart"/>
-      <w:proofErr w:type="gramStart"/>
       <w:r>
         <w:rPr>
           <w:b/>
@@ -4718,7 +4469,6 @@
         <w:t>count.index</w:t>
       </w:r>
       <w:proofErr w:type="spellEnd"/>
-      <w:proofErr w:type="gramEnd"/>
       <w:r>
         <w:rPr>
           <w:b/>
@@ -4764,23 +4514,13 @@
         <w:t xml:space="preserve"> = </w:t>
       </w:r>
       <w:proofErr w:type="spellStart"/>
-      <w:proofErr w:type="gramStart"/>
-      <w:r>
-        <w:rPr>
-          <w:b/>
-          <w:bCs/>
-          <w:color w:val="0000FF"/>
-        </w:rPr>
-        <w:t>var.availability</w:t>
-      </w:r>
-      <w:proofErr w:type="gramEnd"/>
-      <w:r>
-        <w:rPr>
-          <w:b/>
-          <w:bCs/>
-          <w:color w:val="0000FF"/>
-        </w:rPr>
-        <w:t>_zones</w:t>
+      <w:r>
+        <w:rPr>
+          <w:b/>
+          <w:bCs/>
+          <w:color w:val="0000FF"/>
+        </w:rPr>
+        <w:t>var.availability_zones</w:t>
       </w:r>
       <w:proofErr w:type="spellEnd"/>
       <w:r>
@@ -4792,7 +4532,6 @@
         <w:t>[</w:t>
       </w:r>
       <w:proofErr w:type="spellStart"/>
-      <w:proofErr w:type="gramStart"/>
       <w:r>
         <w:rPr>
           <w:b/>
@@ -4802,7 +4541,6 @@
         <w:t>count.index</w:t>
       </w:r>
       <w:proofErr w:type="spellEnd"/>
-      <w:proofErr w:type="gramEnd"/>
       <w:r>
         <w:rPr>
           <w:b/>
@@ -4837,34 +4575,16 @@
           <w:bCs/>
           <w:color w:val="0000FF"/>
         </w:rPr>
-        <w:t xml:space="preserve">  tags = </w:t>
-      </w:r>
-      <w:proofErr w:type="gramStart"/>
-      <w:r>
-        <w:rPr>
-          <w:b/>
-          <w:bCs/>
-          <w:color w:val="0000FF"/>
-        </w:rPr>
-        <w:t>merge(</w:t>
-      </w:r>
-      <w:proofErr w:type="spellStart"/>
-      <w:r>
-        <w:rPr>
-          <w:b/>
-          <w:bCs/>
-          <w:color w:val="0000FF"/>
-        </w:rPr>
-        <w:t>local.common</w:t>
-      </w:r>
-      <w:proofErr w:type="gramEnd"/>
-      <w:r>
-        <w:rPr>
-          <w:b/>
-          <w:bCs/>
-          <w:color w:val="0000FF"/>
-        </w:rPr>
-        <w:t>_tags</w:t>
+        <w:t xml:space="preserve">  tags = merge(</w:t>
+      </w:r>
+      <w:proofErr w:type="spellStart"/>
+      <w:r>
+        <w:rPr>
+          <w:b/>
+          <w:bCs/>
+          <w:color w:val="0000FF"/>
+        </w:rPr>
+        <w:t>local.common_tags</w:t>
       </w:r>
       <w:proofErr w:type="spellEnd"/>
       <w:r>
@@ -4894,23 +4614,13 @@
         <w:t xml:space="preserve">    Name                              = "${</w:t>
       </w:r>
       <w:proofErr w:type="spellStart"/>
-      <w:proofErr w:type="gramStart"/>
-      <w:r>
-        <w:rPr>
-          <w:b/>
-          <w:bCs/>
-          <w:color w:val="0000FF"/>
-        </w:rPr>
-        <w:t>var.project</w:t>
-      </w:r>
-      <w:proofErr w:type="gramEnd"/>
-      <w:r>
-        <w:rPr>
-          <w:b/>
-          <w:bCs/>
-          <w:color w:val="0000FF"/>
-        </w:rPr>
-        <w:t>_name</w:t>
+      <w:r>
+        <w:rPr>
+          <w:b/>
+          <w:bCs/>
+          <w:color w:val="0000FF"/>
+        </w:rPr>
+        <w:t>var.project_name</w:t>
       </w:r>
       <w:proofErr w:type="spellEnd"/>
       <w:r>
@@ -4922,7 +4632,6 @@
         <w:t>}-private-${</w:t>
       </w:r>
       <w:proofErr w:type="spellStart"/>
-      <w:proofErr w:type="gramStart"/>
       <w:r>
         <w:rPr>
           <w:b/>
@@ -4932,7 +4641,6 @@
         <w:t>count.index</w:t>
       </w:r>
       <w:proofErr w:type="spellEnd"/>
-      <w:proofErr w:type="gramEnd"/>
       <w:r>
         <w:rPr>
           <w:b/>
@@ -5121,34 +4829,16 @@
           <w:bCs/>
           <w:color w:val="0000FF"/>
         </w:rPr>
-        <w:t xml:space="preserve">  tags = </w:t>
-      </w:r>
-      <w:proofErr w:type="gramStart"/>
-      <w:r>
-        <w:rPr>
-          <w:b/>
-          <w:bCs/>
-          <w:color w:val="0000FF"/>
-        </w:rPr>
-        <w:t>merge(</w:t>
-      </w:r>
-      <w:proofErr w:type="spellStart"/>
-      <w:r>
-        <w:rPr>
-          <w:b/>
-          <w:bCs/>
-          <w:color w:val="0000FF"/>
-        </w:rPr>
-        <w:t>local.common</w:t>
-      </w:r>
-      <w:proofErr w:type="gramEnd"/>
-      <w:r>
-        <w:rPr>
-          <w:b/>
-          <w:bCs/>
-          <w:color w:val="0000FF"/>
-        </w:rPr>
-        <w:t>_tags</w:t>
+        <w:t xml:space="preserve">  tags = merge(</w:t>
+      </w:r>
+      <w:proofErr w:type="spellStart"/>
+      <w:r>
+        <w:rPr>
+          <w:b/>
+          <w:bCs/>
+          <w:color w:val="0000FF"/>
+        </w:rPr>
+        <w:t>local.common_tags</w:t>
       </w:r>
       <w:proofErr w:type="spellEnd"/>
       <w:r>
@@ -5178,23 +4868,13 @@
         <w:t xml:space="preserve">    Name = "${</w:t>
       </w:r>
       <w:proofErr w:type="spellStart"/>
-      <w:proofErr w:type="gramStart"/>
-      <w:r>
-        <w:rPr>
-          <w:b/>
-          <w:bCs/>
-          <w:color w:val="0000FF"/>
-        </w:rPr>
-        <w:t>var.project</w:t>
-      </w:r>
-      <w:proofErr w:type="gramEnd"/>
-      <w:r>
-        <w:rPr>
-          <w:b/>
-          <w:bCs/>
-          <w:color w:val="0000FF"/>
-        </w:rPr>
-        <w:t>_name</w:t>
+      <w:r>
+        <w:rPr>
+          <w:b/>
+          <w:bCs/>
+          <w:color w:val="0000FF"/>
+        </w:rPr>
+        <w:t>var.project_name</w:t>
       </w:r>
       <w:proofErr w:type="spellEnd"/>
       <w:r>
@@ -5503,19 +5183,9 @@
           <w:bCs/>
           <w:color w:val="0000FF"/>
         </w:rPr>
-        <w:t>aws_</w:t>
-      </w:r>
-      <w:proofErr w:type="gramStart"/>
-      <w:r>
-        <w:rPr>
-          <w:b/>
-          <w:bCs/>
-          <w:color w:val="0000FF"/>
-        </w:rPr>
-        <w:t>subnet.public</w:t>
-      </w:r>
-      <w:proofErr w:type="spellEnd"/>
-      <w:proofErr w:type="gramEnd"/>
+        <w:t>aws_subnet.public</w:t>
+      </w:r>
+      <w:proofErr w:type="spellEnd"/>
       <w:r>
         <w:rPr>
           <w:b/>
@@ -5567,19 +5237,9 @@
           <w:bCs/>
           <w:color w:val="0000FF"/>
         </w:rPr>
-        <w:t>aws_</w:t>
-      </w:r>
-      <w:proofErr w:type="gramStart"/>
-      <w:r>
-        <w:rPr>
-          <w:b/>
-          <w:bCs/>
-          <w:color w:val="0000FF"/>
-        </w:rPr>
-        <w:t>subnet.public</w:t>
-      </w:r>
-      <w:proofErr w:type="spellEnd"/>
-      <w:proofErr w:type="gramEnd"/>
+        <w:t>aws_subnet.public</w:t>
+      </w:r>
+      <w:proofErr w:type="spellEnd"/>
       <w:r>
         <w:rPr>
           <w:b/>
@@ -5589,7 +5249,6 @@
         <w:t>[</w:t>
       </w:r>
       <w:proofErr w:type="spellStart"/>
-      <w:proofErr w:type="gramStart"/>
       <w:r>
         <w:rPr>
           <w:b/>
@@ -5599,7 +5258,6 @@
         <w:t>count.index</w:t>
       </w:r>
       <w:proofErr w:type="spellEnd"/>
-      <w:proofErr w:type="gramEnd"/>
       <w:r>
         <w:rPr>
           <w:b/>
@@ -5788,34 +5446,16 @@
           <w:bCs/>
           <w:color w:val="0000FF"/>
         </w:rPr>
-        <w:t xml:space="preserve">  tags = </w:t>
-      </w:r>
-      <w:proofErr w:type="gramStart"/>
-      <w:r>
-        <w:rPr>
-          <w:b/>
-          <w:bCs/>
-          <w:color w:val="0000FF"/>
-        </w:rPr>
-        <w:t>merge(</w:t>
-      </w:r>
-      <w:proofErr w:type="spellStart"/>
-      <w:r>
-        <w:rPr>
-          <w:b/>
-          <w:bCs/>
-          <w:color w:val="0000FF"/>
-        </w:rPr>
-        <w:t>local.common</w:t>
-      </w:r>
-      <w:proofErr w:type="gramEnd"/>
-      <w:r>
-        <w:rPr>
-          <w:b/>
-          <w:bCs/>
-          <w:color w:val="0000FF"/>
-        </w:rPr>
-        <w:t>_tags</w:t>
+        <w:t xml:space="preserve">  tags = merge(</w:t>
+      </w:r>
+      <w:proofErr w:type="spellStart"/>
+      <w:r>
+        <w:rPr>
+          <w:b/>
+          <w:bCs/>
+          <w:color w:val="0000FF"/>
+        </w:rPr>
+        <w:t>local.common_tags</w:t>
       </w:r>
       <w:proofErr w:type="spellEnd"/>
       <w:r>
@@ -5845,23 +5485,13 @@
         <w:t xml:space="preserve">    Name = "${</w:t>
       </w:r>
       <w:proofErr w:type="spellStart"/>
-      <w:proofErr w:type="gramStart"/>
-      <w:r>
-        <w:rPr>
-          <w:b/>
-          <w:bCs/>
-          <w:color w:val="0000FF"/>
-        </w:rPr>
-        <w:t>var.project</w:t>
-      </w:r>
-      <w:proofErr w:type="gramEnd"/>
-      <w:r>
-        <w:rPr>
-          <w:b/>
-          <w:bCs/>
-          <w:color w:val="0000FF"/>
-        </w:rPr>
-        <w:t>_name</w:t>
+      <w:r>
+        <w:rPr>
+          <w:b/>
+          <w:bCs/>
+          <w:color w:val="0000FF"/>
+        </w:rPr>
+        <w:t>var.project_name</w:t>
       </w:r>
       <w:proofErr w:type="spellEnd"/>
       <w:r>
@@ -6051,19 +5681,9 @@
           <w:bCs/>
           <w:color w:val="0000FF"/>
         </w:rPr>
-        <w:t>aws_</w:t>
-      </w:r>
-      <w:proofErr w:type="gramStart"/>
-      <w:r>
-        <w:rPr>
-          <w:b/>
-          <w:bCs/>
-          <w:color w:val="0000FF"/>
-        </w:rPr>
-        <w:t>subnet.public</w:t>
-      </w:r>
-      <w:proofErr w:type="spellEnd"/>
-      <w:proofErr w:type="gramEnd"/>
+        <w:t>aws_subnet.public</w:t>
+      </w:r>
+      <w:proofErr w:type="spellEnd"/>
       <w:r>
         <w:rPr>
           <w:b/>
@@ -6098,34 +5718,16 @@
           <w:bCs/>
           <w:color w:val="0000FF"/>
         </w:rPr>
-        <w:t xml:space="preserve">  tags = </w:t>
-      </w:r>
-      <w:proofErr w:type="gramStart"/>
-      <w:r>
-        <w:rPr>
-          <w:b/>
-          <w:bCs/>
-          <w:color w:val="0000FF"/>
-        </w:rPr>
-        <w:t>merge(</w:t>
-      </w:r>
-      <w:proofErr w:type="spellStart"/>
-      <w:r>
-        <w:rPr>
-          <w:b/>
-          <w:bCs/>
-          <w:color w:val="0000FF"/>
-        </w:rPr>
-        <w:t>local.common</w:t>
-      </w:r>
-      <w:proofErr w:type="gramEnd"/>
-      <w:r>
-        <w:rPr>
-          <w:b/>
-          <w:bCs/>
-          <w:color w:val="0000FF"/>
-        </w:rPr>
-        <w:t>_tags</w:t>
+        <w:t xml:space="preserve">  tags = merge(</w:t>
+      </w:r>
+      <w:proofErr w:type="spellStart"/>
+      <w:r>
+        <w:rPr>
+          <w:b/>
+          <w:bCs/>
+          <w:color w:val="0000FF"/>
+        </w:rPr>
+        <w:t>local.common_tags</w:t>
       </w:r>
       <w:proofErr w:type="spellEnd"/>
       <w:r>
@@ -6155,23 +5757,13 @@
         <w:t xml:space="preserve">    Name = "${</w:t>
       </w:r>
       <w:proofErr w:type="spellStart"/>
-      <w:proofErr w:type="gramStart"/>
-      <w:r>
-        <w:rPr>
-          <w:b/>
-          <w:bCs/>
-          <w:color w:val="0000FF"/>
-        </w:rPr>
-        <w:t>var.project</w:t>
-      </w:r>
-      <w:proofErr w:type="gramEnd"/>
-      <w:r>
-        <w:rPr>
-          <w:b/>
-          <w:bCs/>
-          <w:color w:val="0000FF"/>
-        </w:rPr>
-        <w:t>_name</w:t>
+      <w:r>
+        <w:rPr>
+          <w:b/>
+          <w:bCs/>
+          <w:color w:val="0000FF"/>
+        </w:rPr>
+        <w:t>var.project_name</w:t>
       </w:r>
       <w:proofErr w:type="spellEnd"/>
       <w:r>
@@ -6271,19 +5863,9 @@
           <w:bCs/>
           <w:color w:val="0000FF"/>
         </w:rPr>
-        <w:t>aws_internet_</w:t>
-      </w:r>
-      <w:proofErr w:type="gramStart"/>
-      <w:r>
-        <w:rPr>
-          <w:b/>
-          <w:bCs/>
-          <w:color w:val="0000FF"/>
-        </w:rPr>
-        <w:t>gateway.main</w:t>
-      </w:r>
-      <w:proofErr w:type="spellEnd"/>
-      <w:proofErr w:type="gramEnd"/>
+        <w:t>aws_internet_gateway.main</w:t>
+      </w:r>
+      <w:proofErr w:type="spellEnd"/>
       <w:r>
         <w:rPr>
           <w:b/>
@@ -6418,34 +6000,16 @@
           <w:bCs/>
           <w:color w:val="0000FF"/>
         </w:rPr>
-        <w:t xml:space="preserve">  tags = </w:t>
-      </w:r>
-      <w:proofErr w:type="gramStart"/>
-      <w:r>
-        <w:rPr>
-          <w:b/>
-          <w:bCs/>
-          <w:color w:val="0000FF"/>
-        </w:rPr>
-        <w:t>merge(</w:t>
-      </w:r>
-      <w:proofErr w:type="spellStart"/>
-      <w:r>
-        <w:rPr>
-          <w:b/>
-          <w:bCs/>
-          <w:color w:val="0000FF"/>
-        </w:rPr>
-        <w:t>local.common</w:t>
-      </w:r>
-      <w:proofErr w:type="gramEnd"/>
-      <w:r>
-        <w:rPr>
-          <w:b/>
-          <w:bCs/>
-          <w:color w:val="0000FF"/>
-        </w:rPr>
-        <w:t>_tags</w:t>
+        <w:t xml:space="preserve">  tags = merge(</w:t>
+      </w:r>
+      <w:proofErr w:type="spellStart"/>
+      <w:r>
+        <w:rPr>
+          <w:b/>
+          <w:bCs/>
+          <w:color w:val="0000FF"/>
+        </w:rPr>
+        <w:t>local.common_tags</w:t>
       </w:r>
       <w:proofErr w:type="spellEnd"/>
       <w:r>
@@ -6475,23 +6039,13 @@
         <w:t xml:space="preserve">    Name = "${</w:t>
       </w:r>
       <w:proofErr w:type="spellStart"/>
-      <w:proofErr w:type="gramStart"/>
-      <w:r>
-        <w:rPr>
-          <w:b/>
-          <w:bCs/>
-          <w:color w:val="0000FF"/>
-        </w:rPr>
-        <w:t>var.project</w:t>
-      </w:r>
-      <w:proofErr w:type="gramEnd"/>
-      <w:r>
-        <w:rPr>
-          <w:b/>
-          <w:bCs/>
-          <w:color w:val="0000FF"/>
-        </w:rPr>
-        <w:t>_name</w:t>
+      <w:r>
+        <w:rPr>
+          <w:b/>
+          <w:bCs/>
+          <w:color w:val="0000FF"/>
+        </w:rPr>
+        <w:t>var.project_name</w:t>
       </w:r>
       <w:proofErr w:type="spellEnd"/>
       <w:r>
@@ -6800,19 +6354,9 @@
           <w:bCs/>
           <w:color w:val="0000FF"/>
         </w:rPr>
-        <w:t>aws_</w:t>
-      </w:r>
-      <w:proofErr w:type="gramStart"/>
-      <w:r>
-        <w:rPr>
-          <w:b/>
-          <w:bCs/>
-          <w:color w:val="0000FF"/>
-        </w:rPr>
-        <w:t>subnet.private</w:t>
-      </w:r>
-      <w:proofErr w:type="spellEnd"/>
-      <w:proofErr w:type="gramEnd"/>
+        <w:t>aws_subnet.private</w:t>
+      </w:r>
+      <w:proofErr w:type="spellEnd"/>
       <w:r>
         <w:rPr>
           <w:b/>
@@ -6864,19 +6408,9 @@
           <w:bCs/>
           <w:color w:val="0000FF"/>
         </w:rPr>
-        <w:t>aws_</w:t>
-      </w:r>
-      <w:proofErr w:type="gramStart"/>
-      <w:r>
-        <w:rPr>
-          <w:b/>
-          <w:bCs/>
-          <w:color w:val="0000FF"/>
-        </w:rPr>
-        <w:t>subnet.private</w:t>
-      </w:r>
-      <w:proofErr w:type="spellEnd"/>
-      <w:proofErr w:type="gramEnd"/>
+        <w:t>aws_subnet.private</w:t>
+      </w:r>
+      <w:proofErr w:type="spellEnd"/>
       <w:r>
         <w:rPr>
           <w:b/>
@@ -6886,7 +6420,6 @@
         <w:t>[</w:t>
       </w:r>
       <w:proofErr w:type="spellStart"/>
-      <w:proofErr w:type="gramStart"/>
       <w:r>
         <w:rPr>
           <w:b/>
@@ -6896,7 +6429,6 @@
         <w:t>count.index</w:t>
       </w:r>
       <w:proofErr w:type="spellEnd"/>
-      <w:proofErr w:type="gramEnd"/>
       <w:r>
         <w:rPr>
           <w:b/>
@@ -7303,34 +6835,16 @@
           <w:bCs/>
           <w:color w:val="0000FF"/>
         </w:rPr>
-        <w:t xml:space="preserve">  tags = </w:t>
-      </w:r>
-      <w:proofErr w:type="gramStart"/>
-      <w:r>
-        <w:rPr>
-          <w:b/>
-          <w:bCs/>
-          <w:color w:val="0000FF"/>
-        </w:rPr>
-        <w:t>merge(</w:t>
-      </w:r>
-      <w:proofErr w:type="spellStart"/>
-      <w:r>
-        <w:rPr>
-          <w:b/>
-          <w:bCs/>
-          <w:color w:val="0000FF"/>
-        </w:rPr>
-        <w:t>local.common</w:t>
-      </w:r>
-      <w:proofErr w:type="gramEnd"/>
-      <w:r>
-        <w:rPr>
-          <w:b/>
-          <w:bCs/>
-          <w:color w:val="0000FF"/>
-        </w:rPr>
-        <w:t>_tags</w:t>
+        <w:t xml:space="preserve">  tags = merge(</w:t>
+      </w:r>
+      <w:proofErr w:type="spellStart"/>
+      <w:r>
+        <w:rPr>
+          <w:b/>
+          <w:bCs/>
+          <w:color w:val="0000FF"/>
+        </w:rPr>
+        <w:t>local.common_tags</w:t>
       </w:r>
       <w:proofErr w:type="spellEnd"/>
       <w:r>
@@ -7496,23 +7010,13 @@
         <w:t xml:space="preserve">  name = "${</w:t>
       </w:r>
       <w:proofErr w:type="spellStart"/>
-      <w:proofErr w:type="gramStart"/>
-      <w:r>
-        <w:rPr>
-          <w:b/>
-          <w:bCs/>
-          <w:color w:val="0000FF"/>
-        </w:rPr>
-        <w:t>var.project</w:t>
-      </w:r>
-      <w:proofErr w:type="gramEnd"/>
-      <w:r>
-        <w:rPr>
-          <w:b/>
-          <w:bCs/>
-          <w:color w:val="0000FF"/>
-        </w:rPr>
-        <w:t>_name</w:t>
+      <w:r>
+        <w:rPr>
+          <w:b/>
+          <w:bCs/>
+          <w:color w:val="0000FF"/>
+        </w:rPr>
+        <w:t>var.project_name</w:t>
       </w:r>
       <w:proofErr w:type="spellEnd"/>
       <w:r>
@@ -7588,7 +7092,6 @@
         <w:t xml:space="preserve"> = </w:t>
       </w:r>
       <w:proofErr w:type="spellStart"/>
-      <w:proofErr w:type="gramStart"/>
       <w:r>
         <w:rPr>
           <w:b/>
@@ -7604,16 +7107,7 @@
           <w:bCs/>
           <w:color w:val="0000FF"/>
         </w:rPr>
-        <w:t>(</w:t>
-      </w:r>
-      <w:proofErr w:type="gramEnd"/>
-      <w:r>
-        <w:rPr>
-          <w:b/>
-          <w:bCs/>
-          <w:color w:val="0000FF"/>
-        </w:rPr>
-        <w:t>{</w:t>
+        <w:t>({</w:t>
       </w:r>
     </w:p>
     <w:p>
@@ -7742,7 +7236,6 @@
         <w:t xml:space="preserve">      Action = "</w:t>
       </w:r>
       <w:proofErr w:type="spellStart"/>
-      <w:proofErr w:type="gramStart"/>
       <w:r>
         <w:rPr>
           <w:b/>
@@ -7752,7 +7245,6 @@
         <w:t>sts:AssumeRole</w:t>
       </w:r>
       <w:proofErr w:type="spellEnd"/>
-      <w:proofErr w:type="gramEnd"/>
       <w:r>
         <w:rPr>
           <w:b/>
@@ -7827,23 +7319,13 @@
         <w:t xml:space="preserve">  tags = </w:t>
       </w:r>
       <w:proofErr w:type="spellStart"/>
-      <w:proofErr w:type="gramStart"/>
-      <w:r>
-        <w:rPr>
-          <w:b/>
-          <w:bCs/>
-          <w:color w:val="0000FF"/>
-        </w:rPr>
-        <w:t>local.common</w:t>
-      </w:r>
-      <w:proofErr w:type="gramEnd"/>
-      <w:r>
-        <w:rPr>
-          <w:b/>
-          <w:bCs/>
-          <w:color w:val="0000FF"/>
-        </w:rPr>
-        <w:t>_tags</w:t>
+      <w:r>
+        <w:rPr>
+          <w:b/>
+          <w:bCs/>
+          <w:color w:val="0000FF"/>
+        </w:rPr>
+        <w:t>local.common_tags</w:t>
       </w:r>
       <w:proofErr w:type="spellEnd"/>
     </w:p>
@@ -7983,32 +7465,13 @@
         <w:t xml:space="preserve"> = "</w:t>
       </w:r>
       <w:proofErr w:type="spellStart"/>
-      <w:proofErr w:type="gramStart"/>
-      <w:r>
-        <w:rPr>
-          <w:b/>
-          <w:bCs/>
-          <w:color w:val="0000FF"/>
-        </w:rPr>
-        <w:t>arn:aws</w:t>
-      </w:r>
-      <w:proofErr w:type="gramEnd"/>
-      <w:r>
-        <w:rPr>
-          <w:b/>
-          <w:bCs/>
-          <w:color w:val="0000FF"/>
-        </w:rPr>
-        <w:t>:</w:t>
-      </w:r>
-      <w:proofErr w:type="gramStart"/>
-      <w:r>
-        <w:rPr>
-          <w:b/>
-          <w:bCs/>
-          <w:color w:val="0000FF"/>
-        </w:rPr>
-        <w:t>iam</w:t>
+      <w:r>
+        <w:rPr>
+          <w:b/>
+          <w:bCs/>
+          <w:color w:val="0000FF"/>
+        </w:rPr>
+        <w:t>arn:aws:iam</w:t>
       </w:r>
       <w:proofErr w:type="spellEnd"/>
       <w:r>
@@ -8029,7 +7492,6 @@
         <w:t>aws:policy</w:t>
       </w:r>
       <w:proofErr w:type="spellEnd"/>
-      <w:proofErr w:type="gramEnd"/>
       <w:r>
         <w:rPr>
           <w:b/>
@@ -8157,23 +7619,13 @@
         <w:t xml:space="preserve">  name = "${</w:t>
       </w:r>
       <w:proofErr w:type="spellStart"/>
-      <w:proofErr w:type="gramStart"/>
-      <w:r>
-        <w:rPr>
-          <w:b/>
-          <w:bCs/>
-          <w:color w:val="0000FF"/>
-        </w:rPr>
-        <w:t>var.project</w:t>
-      </w:r>
-      <w:proofErr w:type="gramEnd"/>
-      <w:r>
-        <w:rPr>
-          <w:b/>
-          <w:bCs/>
-          <w:color w:val="0000FF"/>
-        </w:rPr>
-        <w:t>_name</w:t>
+      <w:r>
+        <w:rPr>
+          <w:b/>
+          <w:bCs/>
+          <w:color w:val="0000FF"/>
+        </w:rPr>
+        <w:t>var.project_name</w:t>
       </w:r>
       <w:proofErr w:type="spellEnd"/>
       <w:r>
@@ -8249,7 +7701,6 @@
         <w:t xml:space="preserve"> = </w:t>
       </w:r>
       <w:proofErr w:type="spellStart"/>
-      <w:proofErr w:type="gramStart"/>
       <w:r>
         <w:rPr>
           <w:b/>
@@ -8265,16 +7716,7 @@
           <w:bCs/>
           <w:color w:val="0000FF"/>
         </w:rPr>
-        <w:t>(</w:t>
-      </w:r>
-      <w:proofErr w:type="gramEnd"/>
-      <w:r>
-        <w:rPr>
-          <w:b/>
-          <w:bCs/>
-          <w:color w:val="0000FF"/>
-        </w:rPr>
-        <w:t>{</w:t>
+        <w:t>({</w:t>
       </w:r>
     </w:p>
     <w:p>
@@ -8403,7 +7845,6 @@
         <w:t xml:space="preserve">      Action = "</w:t>
       </w:r>
       <w:proofErr w:type="spellStart"/>
-      <w:proofErr w:type="gramStart"/>
       <w:r>
         <w:rPr>
           <w:b/>
@@ -8413,7 +7854,6 @@
         <w:t>sts:AssumeRole</w:t>
       </w:r>
       <w:proofErr w:type="spellEnd"/>
-      <w:proofErr w:type="gramEnd"/>
       <w:r>
         <w:rPr>
           <w:b/>
@@ -8487,23 +7927,13 @@
         <w:t xml:space="preserve">  tags = </w:t>
       </w:r>
       <w:proofErr w:type="spellStart"/>
-      <w:proofErr w:type="gramStart"/>
-      <w:r>
-        <w:rPr>
-          <w:b/>
-          <w:bCs/>
-          <w:color w:val="0000FF"/>
-        </w:rPr>
-        <w:t>local.common</w:t>
-      </w:r>
-      <w:proofErr w:type="gramEnd"/>
-      <w:r>
-        <w:rPr>
-          <w:b/>
-          <w:bCs/>
-          <w:color w:val="0000FF"/>
-        </w:rPr>
-        <w:t>_tags</w:t>
+      <w:r>
+        <w:rPr>
+          <w:b/>
+          <w:bCs/>
+          <w:color w:val="0000FF"/>
+        </w:rPr>
+        <w:t>local.common_tags</w:t>
       </w:r>
       <w:proofErr w:type="spellEnd"/>
     </w:p>
@@ -8643,32 +8073,13 @@
         <w:t xml:space="preserve"> = "</w:t>
       </w:r>
       <w:proofErr w:type="spellStart"/>
-      <w:proofErr w:type="gramStart"/>
-      <w:r>
-        <w:rPr>
-          <w:b/>
-          <w:bCs/>
-          <w:color w:val="0000FF"/>
-        </w:rPr>
-        <w:t>arn:aws</w:t>
-      </w:r>
-      <w:proofErr w:type="gramEnd"/>
-      <w:r>
-        <w:rPr>
-          <w:b/>
-          <w:bCs/>
-          <w:color w:val="0000FF"/>
-        </w:rPr>
-        <w:t>:</w:t>
-      </w:r>
-      <w:proofErr w:type="gramStart"/>
-      <w:r>
-        <w:rPr>
-          <w:b/>
-          <w:bCs/>
-          <w:color w:val="0000FF"/>
-        </w:rPr>
-        <w:t>iam</w:t>
+      <w:r>
+        <w:rPr>
+          <w:b/>
+          <w:bCs/>
+          <w:color w:val="0000FF"/>
+        </w:rPr>
+        <w:t>arn:aws:iam</w:t>
       </w:r>
       <w:proofErr w:type="spellEnd"/>
       <w:r>
@@ -8689,7 +8100,6 @@
         <w:t>aws:policy</w:t>
       </w:r>
       <w:proofErr w:type="spellEnd"/>
-      <w:proofErr w:type="gramEnd"/>
       <w:r>
         <w:rPr>
           <w:b/>
@@ -8853,32 +8263,13 @@
         <w:t xml:space="preserve"> = "</w:t>
       </w:r>
       <w:proofErr w:type="spellStart"/>
-      <w:proofErr w:type="gramStart"/>
-      <w:r>
-        <w:rPr>
-          <w:b/>
-          <w:bCs/>
-          <w:color w:val="0000FF"/>
-        </w:rPr>
-        <w:t>arn:aws</w:t>
-      </w:r>
-      <w:proofErr w:type="gramEnd"/>
-      <w:r>
-        <w:rPr>
-          <w:b/>
-          <w:bCs/>
-          <w:color w:val="0000FF"/>
-        </w:rPr>
-        <w:t>:</w:t>
-      </w:r>
-      <w:proofErr w:type="gramStart"/>
-      <w:r>
-        <w:rPr>
-          <w:b/>
-          <w:bCs/>
-          <w:color w:val="0000FF"/>
-        </w:rPr>
-        <w:t>iam</w:t>
+      <w:r>
+        <w:rPr>
+          <w:b/>
+          <w:bCs/>
+          <w:color w:val="0000FF"/>
+        </w:rPr>
+        <w:t>arn:aws:iam</w:t>
       </w:r>
       <w:proofErr w:type="spellEnd"/>
       <w:r>
@@ -8899,7 +8290,6 @@
         <w:t>aws:policy</w:t>
       </w:r>
       <w:proofErr w:type="spellEnd"/>
-      <w:proofErr w:type="gramEnd"/>
       <w:r>
         <w:rPr>
           <w:b/>
@@ -9063,32 +8453,13 @@
         <w:t xml:space="preserve"> = "</w:t>
       </w:r>
       <w:proofErr w:type="spellStart"/>
-      <w:proofErr w:type="gramStart"/>
-      <w:r>
-        <w:rPr>
-          <w:b/>
-          <w:bCs/>
-          <w:color w:val="0000FF"/>
-        </w:rPr>
-        <w:t>arn:aws</w:t>
-      </w:r>
-      <w:proofErr w:type="gramEnd"/>
-      <w:r>
-        <w:rPr>
-          <w:b/>
-          <w:bCs/>
-          <w:color w:val="0000FF"/>
-        </w:rPr>
-        <w:t>:</w:t>
-      </w:r>
-      <w:proofErr w:type="gramStart"/>
-      <w:r>
-        <w:rPr>
-          <w:b/>
-          <w:bCs/>
-          <w:color w:val="0000FF"/>
-        </w:rPr>
-        <w:t>iam</w:t>
+      <w:r>
+        <w:rPr>
+          <w:b/>
+          <w:bCs/>
+          <w:color w:val="0000FF"/>
+        </w:rPr>
+        <w:t>arn:aws:iam</w:t>
       </w:r>
       <w:proofErr w:type="spellEnd"/>
       <w:r>
@@ -9109,7 +8480,6 @@
         <w:t>aws:policy</w:t>
       </w:r>
       <w:proofErr w:type="spellEnd"/>
-      <w:proofErr w:type="gramEnd"/>
       <w:r>
         <w:rPr>
           <w:b/>
@@ -9273,36 +8643,244 @@
           <w:bCs/>
           <w:color w:val="0000FF"/>
         </w:rPr>
+        <w:t xml:space="preserve">  version  = </w:t>
+      </w:r>
+      <w:proofErr w:type="spellStart"/>
+      <w:r>
+        <w:rPr>
+          <w:b/>
+          <w:bCs/>
+          <w:color w:val="0000FF"/>
+        </w:rPr>
+        <w:t>var.eks_version</w:t>
+      </w:r>
+      <w:proofErr w:type="spellEnd"/>
+    </w:p>
+    <w:p>
+      <w:pPr>
+        <w:pStyle w:val="ListParagraph"/>
+        <w:rPr>
+          <w:b/>
+          <w:bCs/>
+          <w:color w:val="0000FF"/>
+        </w:rPr>
+      </w:pPr>
+    </w:p>
+    <w:p>
+      <w:pPr>
+        <w:pStyle w:val="ListParagraph"/>
+        <w:rPr>
+          <w:b/>
+          <w:bCs/>
+          <w:color w:val="0000FF"/>
+        </w:rPr>
+      </w:pPr>
+      <w:r>
+        <w:rPr>
+          <w:b/>
+          <w:bCs/>
+          <w:color w:val="0000FF"/>
+        </w:rPr>
         <w:t xml:space="preserve">  </w:t>
       </w:r>
-      <w:proofErr w:type="gramStart"/>
-      <w:r>
-        <w:rPr>
-          <w:b/>
-          <w:bCs/>
-          <w:color w:val="0000FF"/>
-        </w:rPr>
-        <w:t>version  =</w:t>
-      </w:r>
-      <w:proofErr w:type="gramEnd"/>
-      <w:r>
-        <w:rPr>
-          <w:b/>
-          <w:bCs/>
-          <w:color w:val="0000FF"/>
-        </w:rPr>
-        <w:t xml:space="preserve"> </w:t>
-      </w:r>
-      <w:proofErr w:type="spellStart"/>
-      <w:r>
-        <w:rPr>
-          <w:b/>
-          <w:bCs/>
-          <w:color w:val="0000FF"/>
-        </w:rPr>
-        <w:t>var.eks_version</w:t>
-      </w:r>
-      <w:proofErr w:type="spellEnd"/>
+      <w:proofErr w:type="spellStart"/>
+      <w:r>
+        <w:rPr>
+          <w:b/>
+          <w:bCs/>
+          <w:color w:val="0000FF"/>
+        </w:rPr>
+        <w:t>vpc_config</w:t>
+      </w:r>
+      <w:proofErr w:type="spellEnd"/>
+      <w:r>
+        <w:rPr>
+          <w:b/>
+          <w:bCs/>
+          <w:color w:val="0000FF"/>
+        </w:rPr>
+        <w:t xml:space="preserve"> {</w:t>
+      </w:r>
+    </w:p>
+    <w:p>
+      <w:pPr>
+        <w:pStyle w:val="ListParagraph"/>
+        <w:rPr>
+          <w:b/>
+          <w:bCs/>
+          <w:color w:val="0000FF"/>
+        </w:rPr>
+      </w:pPr>
+      <w:r>
+        <w:rPr>
+          <w:b/>
+          <w:bCs/>
+          <w:color w:val="0000FF"/>
+        </w:rPr>
+        <w:t xml:space="preserve">    </w:t>
+      </w:r>
+      <w:proofErr w:type="spellStart"/>
+      <w:r>
+        <w:rPr>
+          <w:b/>
+          <w:bCs/>
+          <w:color w:val="0000FF"/>
+        </w:rPr>
+        <w:t>subnet_ids</w:t>
+      </w:r>
+      <w:proofErr w:type="spellEnd"/>
+      <w:r>
+        <w:rPr>
+          <w:b/>
+          <w:bCs/>
+          <w:color w:val="0000FF"/>
+        </w:rPr>
+        <w:t xml:space="preserve">              = </w:t>
+      </w:r>
+      <w:proofErr w:type="spellStart"/>
+      <w:r>
+        <w:rPr>
+          <w:b/>
+          <w:bCs/>
+          <w:color w:val="0000FF"/>
+        </w:rPr>
+        <w:t>concat</w:t>
+      </w:r>
+      <w:proofErr w:type="spellEnd"/>
+      <w:r>
+        <w:rPr>
+          <w:b/>
+          <w:bCs/>
+          <w:color w:val="0000FF"/>
+        </w:rPr>
+        <w:t>(</w:t>
+      </w:r>
+      <w:proofErr w:type="spellStart"/>
+      <w:r>
+        <w:rPr>
+          <w:b/>
+          <w:bCs/>
+          <w:color w:val="0000FF"/>
+        </w:rPr>
+        <w:t>aws_subnet.public</w:t>
+      </w:r>
+      <w:proofErr w:type="spellEnd"/>
+      <w:r>
+        <w:rPr>
+          <w:b/>
+          <w:bCs/>
+          <w:color w:val="0000FF"/>
+        </w:rPr>
+        <w:t xml:space="preserve">[*].id, </w:t>
+      </w:r>
+      <w:proofErr w:type="spellStart"/>
+      <w:r>
+        <w:rPr>
+          <w:b/>
+          <w:bCs/>
+          <w:color w:val="0000FF"/>
+        </w:rPr>
+        <w:t>aws_subnet.private</w:t>
+      </w:r>
+      <w:proofErr w:type="spellEnd"/>
+      <w:r>
+        <w:rPr>
+          <w:b/>
+          <w:bCs/>
+          <w:color w:val="0000FF"/>
+        </w:rPr>
+        <w:t>[*].id)</w:t>
+      </w:r>
+    </w:p>
+    <w:p>
+      <w:pPr>
+        <w:pStyle w:val="ListParagraph"/>
+        <w:rPr>
+          <w:b/>
+          <w:bCs/>
+          <w:color w:val="0000FF"/>
+        </w:rPr>
+      </w:pPr>
+      <w:r>
+        <w:rPr>
+          <w:b/>
+          <w:bCs/>
+          <w:color w:val="0000FF"/>
+        </w:rPr>
+        <w:t xml:space="preserve">    </w:t>
+      </w:r>
+      <w:proofErr w:type="spellStart"/>
+      <w:r>
+        <w:rPr>
+          <w:b/>
+          <w:bCs/>
+          <w:color w:val="0000FF"/>
+        </w:rPr>
+        <w:t>endpoint_private_access</w:t>
+      </w:r>
+      <w:proofErr w:type="spellEnd"/>
+      <w:r>
+        <w:rPr>
+          <w:b/>
+          <w:bCs/>
+          <w:color w:val="0000FF"/>
+        </w:rPr>
+        <w:t xml:space="preserve"> = true</w:t>
+      </w:r>
+    </w:p>
+    <w:p>
+      <w:pPr>
+        <w:pStyle w:val="ListParagraph"/>
+        <w:rPr>
+          <w:b/>
+          <w:bCs/>
+          <w:color w:val="0000FF"/>
+        </w:rPr>
+      </w:pPr>
+      <w:r>
+        <w:rPr>
+          <w:b/>
+          <w:bCs/>
+          <w:color w:val="0000FF"/>
+        </w:rPr>
+        <w:t xml:space="preserve">    </w:t>
+      </w:r>
+      <w:proofErr w:type="spellStart"/>
+      <w:r>
+        <w:rPr>
+          <w:b/>
+          <w:bCs/>
+          <w:color w:val="0000FF"/>
+        </w:rPr>
+        <w:t>endpoint_public_access</w:t>
+      </w:r>
+      <w:proofErr w:type="spellEnd"/>
+      <w:r>
+        <w:rPr>
+          <w:b/>
+          <w:bCs/>
+          <w:color w:val="0000FF"/>
+        </w:rPr>
+        <w:t xml:space="preserve">  = true</w:t>
+      </w:r>
+    </w:p>
+    <w:p>
+      <w:pPr>
+        <w:pStyle w:val="ListParagraph"/>
+        <w:rPr>
+          <w:b/>
+          <w:bCs/>
+          <w:color w:val="0000FF"/>
+        </w:rPr>
+      </w:pPr>
+      <w:r>
+        <w:rPr>
+          <w:b/>
+          <w:bCs/>
+          <w:color w:val="0000FF"/>
+        </w:rPr>
+        <w:t xml:space="preserve">  }</w:t>
+      </w:r>
     </w:p>
     <w:p>
       <w:pPr>
@@ -9338,16 +8916,206 @@
           <w:bCs/>
           <w:color w:val="0000FF"/>
         </w:rPr>
-        <w:t>vpc_config</w:t>
-      </w:r>
-      <w:proofErr w:type="spellEnd"/>
-      <w:r>
-        <w:rPr>
-          <w:b/>
-          <w:bCs/>
-          <w:color w:val="0000FF"/>
-        </w:rPr>
-        <w:t xml:space="preserve"> {</w:t>
+        <w:t>enabled_cluster_log_types</w:t>
+      </w:r>
+      <w:proofErr w:type="spellEnd"/>
+      <w:r>
+        <w:rPr>
+          <w:b/>
+          <w:bCs/>
+          <w:color w:val="0000FF"/>
+        </w:rPr>
+        <w:t xml:space="preserve"> = [</w:t>
+      </w:r>
+    </w:p>
+    <w:p>
+      <w:pPr>
+        <w:pStyle w:val="ListParagraph"/>
+        <w:rPr>
+          <w:b/>
+          <w:bCs/>
+          <w:color w:val="0000FF"/>
+        </w:rPr>
+      </w:pPr>
+      <w:r>
+        <w:rPr>
+          <w:b/>
+          <w:bCs/>
+          <w:color w:val="0000FF"/>
+        </w:rPr>
+        <w:t xml:space="preserve">    "</w:t>
+      </w:r>
+      <w:proofErr w:type="spellStart"/>
+      <w:r>
+        <w:rPr>
+          <w:b/>
+          <w:bCs/>
+          <w:color w:val="0000FF"/>
+        </w:rPr>
+        <w:t>api</w:t>
+      </w:r>
+      <w:proofErr w:type="spellEnd"/>
+      <w:r>
+        <w:rPr>
+          <w:b/>
+          <w:bCs/>
+          <w:color w:val="0000FF"/>
+        </w:rPr>
+        <w:t>",</w:t>
+      </w:r>
+    </w:p>
+    <w:p>
+      <w:pPr>
+        <w:pStyle w:val="ListParagraph"/>
+        <w:rPr>
+          <w:b/>
+          <w:bCs/>
+          <w:color w:val="0000FF"/>
+        </w:rPr>
+      </w:pPr>
+      <w:r>
+        <w:rPr>
+          <w:b/>
+          <w:bCs/>
+          <w:color w:val="0000FF"/>
+        </w:rPr>
+        <w:t xml:space="preserve">    "audit",</w:t>
+      </w:r>
+    </w:p>
+    <w:p>
+      <w:pPr>
+        <w:pStyle w:val="ListParagraph"/>
+        <w:rPr>
+          <w:b/>
+          <w:bCs/>
+          <w:color w:val="0000FF"/>
+        </w:rPr>
+      </w:pPr>
+      <w:r>
+        <w:rPr>
+          <w:b/>
+          <w:bCs/>
+          <w:color w:val="0000FF"/>
+        </w:rPr>
+        <w:t xml:space="preserve">    "authenticator",</w:t>
+      </w:r>
+    </w:p>
+    <w:p>
+      <w:pPr>
+        <w:pStyle w:val="ListParagraph"/>
+        <w:rPr>
+          <w:b/>
+          <w:bCs/>
+          <w:color w:val="0000FF"/>
+        </w:rPr>
+      </w:pPr>
+      <w:r>
+        <w:rPr>
+          <w:b/>
+          <w:bCs/>
+          <w:color w:val="0000FF"/>
+        </w:rPr>
+        <w:t xml:space="preserve">    "</w:t>
+      </w:r>
+      <w:proofErr w:type="spellStart"/>
+      <w:r>
+        <w:rPr>
+          <w:b/>
+          <w:bCs/>
+          <w:color w:val="0000FF"/>
+        </w:rPr>
+        <w:t>controllerManager</w:t>
+      </w:r>
+      <w:proofErr w:type="spellEnd"/>
+      <w:r>
+        <w:rPr>
+          <w:b/>
+          <w:bCs/>
+          <w:color w:val="0000FF"/>
+        </w:rPr>
+        <w:t>",</w:t>
+      </w:r>
+    </w:p>
+    <w:p>
+      <w:pPr>
+        <w:pStyle w:val="ListParagraph"/>
+        <w:rPr>
+          <w:b/>
+          <w:bCs/>
+          <w:color w:val="0000FF"/>
+        </w:rPr>
+      </w:pPr>
+      <w:r>
+        <w:rPr>
+          <w:b/>
+          <w:bCs/>
+          <w:color w:val="0000FF"/>
+        </w:rPr>
+        <w:t xml:space="preserve">    "scheduler"</w:t>
+      </w:r>
+    </w:p>
+    <w:p>
+      <w:pPr>
+        <w:pStyle w:val="ListParagraph"/>
+        <w:rPr>
+          <w:b/>
+          <w:bCs/>
+          <w:color w:val="0000FF"/>
+        </w:rPr>
+      </w:pPr>
+      <w:r>
+        <w:rPr>
+          <w:b/>
+          <w:bCs/>
+          <w:color w:val="0000FF"/>
+        </w:rPr>
+        <w:t xml:space="preserve">  ]</w:t>
+      </w:r>
+    </w:p>
+    <w:p>
+      <w:pPr>
+        <w:pStyle w:val="ListParagraph"/>
+        <w:rPr>
+          <w:b/>
+          <w:bCs/>
+          <w:color w:val="0000FF"/>
+        </w:rPr>
+      </w:pPr>
+    </w:p>
+    <w:p>
+      <w:pPr>
+        <w:pStyle w:val="ListParagraph"/>
+        <w:rPr>
+          <w:b/>
+          <w:bCs/>
+          <w:color w:val="0000FF"/>
+        </w:rPr>
+      </w:pPr>
+      <w:r>
+        <w:rPr>
+          <w:b/>
+          <w:bCs/>
+          <w:color w:val="0000FF"/>
+        </w:rPr>
+        <w:t xml:space="preserve">  </w:t>
+      </w:r>
+      <w:proofErr w:type="spellStart"/>
+      <w:r>
+        <w:rPr>
+          <w:b/>
+          <w:bCs/>
+          <w:color w:val="0000FF"/>
+        </w:rPr>
+        <w:t>depends_on</w:t>
+      </w:r>
+      <w:proofErr w:type="spellEnd"/>
+      <w:r>
+        <w:rPr>
+          <w:b/>
+          <w:bCs/>
+          <w:color w:val="0000FF"/>
+        </w:rPr>
+        <w:t xml:space="preserve"> = [</w:t>
       </w:r>
     </w:p>
     <w:p>
@@ -9374,6 +9142,344 @@
           <w:bCs/>
           <w:color w:val="0000FF"/>
         </w:rPr>
+        <w:t>aws_iam_role_policy_attachment.eks_cluster_policy</w:t>
+      </w:r>
+      <w:proofErr w:type="spellEnd"/>
+    </w:p>
+    <w:p>
+      <w:pPr>
+        <w:pStyle w:val="ListParagraph"/>
+        <w:rPr>
+          <w:b/>
+          <w:bCs/>
+          <w:color w:val="0000FF"/>
+        </w:rPr>
+      </w:pPr>
+      <w:r>
+        <w:rPr>
+          <w:b/>
+          <w:bCs/>
+          <w:color w:val="0000FF"/>
+        </w:rPr>
+        <w:t xml:space="preserve">  ]</w:t>
+      </w:r>
+    </w:p>
+    <w:p>
+      <w:pPr>
+        <w:pStyle w:val="ListParagraph"/>
+        <w:rPr>
+          <w:b/>
+          <w:bCs/>
+          <w:color w:val="0000FF"/>
+        </w:rPr>
+      </w:pPr>
+    </w:p>
+    <w:p>
+      <w:pPr>
+        <w:pStyle w:val="ListParagraph"/>
+        <w:rPr>
+          <w:b/>
+          <w:bCs/>
+          <w:color w:val="0000FF"/>
+        </w:rPr>
+      </w:pPr>
+      <w:r>
+        <w:rPr>
+          <w:b/>
+          <w:bCs/>
+          <w:color w:val="0000FF"/>
+        </w:rPr>
+        <w:t xml:space="preserve">  tags = merge(</w:t>
+      </w:r>
+      <w:proofErr w:type="spellStart"/>
+      <w:r>
+        <w:rPr>
+          <w:b/>
+          <w:bCs/>
+          <w:color w:val="0000FF"/>
+        </w:rPr>
+        <w:t>local.common_tags</w:t>
+      </w:r>
+      <w:proofErr w:type="spellEnd"/>
+      <w:r>
+        <w:rPr>
+          <w:b/>
+          <w:bCs/>
+          <w:color w:val="0000FF"/>
+        </w:rPr>
+        <w:t>, {</w:t>
+      </w:r>
+    </w:p>
+    <w:p>
+      <w:pPr>
+        <w:pStyle w:val="ListParagraph"/>
+        <w:rPr>
+          <w:b/>
+          <w:bCs/>
+          <w:color w:val="0000FF"/>
+        </w:rPr>
+      </w:pPr>
+      <w:r>
+        <w:rPr>
+          <w:b/>
+          <w:bCs/>
+          <w:color w:val="0000FF"/>
+        </w:rPr>
+        <w:t xml:space="preserve">    Name = </w:t>
+      </w:r>
+      <w:proofErr w:type="spellStart"/>
+      <w:r>
+        <w:rPr>
+          <w:b/>
+          <w:bCs/>
+          <w:color w:val="0000FF"/>
+        </w:rPr>
+        <w:t>var.eks_cluster_name</w:t>
+      </w:r>
+      <w:proofErr w:type="spellEnd"/>
+    </w:p>
+    <w:p>
+      <w:pPr>
+        <w:pStyle w:val="ListParagraph"/>
+        <w:rPr>
+          <w:b/>
+          <w:bCs/>
+          <w:color w:val="0000FF"/>
+        </w:rPr>
+      </w:pPr>
+      <w:r>
+        <w:rPr>
+          <w:b/>
+          <w:bCs/>
+          <w:color w:val="0000FF"/>
+        </w:rPr>
+        <w:t xml:space="preserve">  })</w:t>
+      </w:r>
+    </w:p>
+    <w:p>
+      <w:pPr>
+        <w:pStyle w:val="ListParagraph"/>
+        <w:rPr>
+          <w:b/>
+          <w:bCs/>
+          <w:color w:val="0000FF"/>
+        </w:rPr>
+      </w:pPr>
+      <w:r>
+        <w:rPr>
+          <w:b/>
+          <w:bCs/>
+          <w:color w:val="0000FF"/>
+        </w:rPr>
+        <w:t>}</w:t>
+      </w:r>
+    </w:p>
+    <w:p>
+      <w:pPr>
+        <w:pStyle w:val="ListParagraph"/>
+        <w:rPr>
+          <w:b/>
+          <w:bCs/>
+          <w:color w:val="0000FF"/>
+        </w:rPr>
+      </w:pPr>
+    </w:p>
+    <w:p>
+      <w:pPr>
+        <w:pStyle w:val="ListParagraph"/>
+        <w:rPr>
+          <w:b/>
+          <w:bCs/>
+          <w:color w:val="0000FF"/>
+        </w:rPr>
+      </w:pPr>
+      <w:r>
+        <w:rPr>
+          <w:b/>
+          <w:bCs/>
+          <w:color w:val="0000FF"/>
+        </w:rPr>
+        <w:t>resource "</w:t>
+      </w:r>
+      <w:proofErr w:type="spellStart"/>
+      <w:r>
+        <w:rPr>
+          <w:b/>
+          <w:bCs/>
+          <w:color w:val="0000FF"/>
+        </w:rPr>
+        <w:t>aws_eks_node_group</w:t>
+      </w:r>
+      <w:proofErr w:type="spellEnd"/>
+      <w:r>
+        <w:rPr>
+          <w:b/>
+          <w:bCs/>
+          <w:color w:val="0000FF"/>
+        </w:rPr>
+        <w:t>" "main" {</w:t>
+      </w:r>
+    </w:p>
+    <w:p>
+      <w:pPr>
+        <w:pStyle w:val="ListParagraph"/>
+        <w:rPr>
+          <w:b/>
+          <w:bCs/>
+          <w:color w:val="0000FF"/>
+        </w:rPr>
+      </w:pPr>
+      <w:r>
+        <w:rPr>
+          <w:b/>
+          <w:bCs/>
+          <w:color w:val="0000FF"/>
+        </w:rPr>
+        <w:t xml:space="preserve">  </w:t>
+      </w:r>
+      <w:proofErr w:type="spellStart"/>
+      <w:r>
+        <w:rPr>
+          <w:b/>
+          <w:bCs/>
+          <w:color w:val="0000FF"/>
+        </w:rPr>
+        <w:t>cluster_name</w:t>
+      </w:r>
+      <w:proofErr w:type="spellEnd"/>
+      <w:r>
+        <w:rPr>
+          <w:b/>
+          <w:bCs/>
+          <w:color w:val="0000FF"/>
+        </w:rPr>
+        <w:t xml:space="preserve">    = aws_eks_cluster.main.name</w:t>
+      </w:r>
+    </w:p>
+    <w:p>
+      <w:pPr>
+        <w:pStyle w:val="ListParagraph"/>
+        <w:rPr>
+          <w:b/>
+          <w:bCs/>
+          <w:color w:val="0000FF"/>
+        </w:rPr>
+      </w:pPr>
+      <w:r>
+        <w:rPr>
+          <w:b/>
+          <w:bCs/>
+          <w:color w:val="0000FF"/>
+        </w:rPr>
+        <w:t xml:space="preserve">  </w:t>
+      </w:r>
+      <w:proofErr w:type="spellStart"/>
+      <w:r>
+        <w:rPr>
+          <w:b/>
+          <w:bCs/>
+          <w:color w:val="0000FF"/>
+        </w:rPr>
+        <w:t>node_group_name</w:t>
+      </w:r>
+      <w:proofErr w:type="spellEnd"/>
+      <w:r>
+        <w:rPr>
+          <w:b/>
+          <w:bCs/>
+          <w:color w:val="0000FF"/>
+        </w:rPr>
+        <w:t xml:space="preserve"> = "${</w:t>
+      </w:r>
+      <w:proofErr w:type="spellStart"/>
+      <w:r>
+        <w:rPr>
+          <w:b/>
+          <w:bCs/>
+          <w:color w:val="0000FF"/>
+        </w:rPr>
+        <w:t>var.project_name</w:t>
+      </w:r>
+      <w:proofErr w:type="spellEnd"/>
+      <w:r>
+        <w:rPr>
+          <w:b/>
+          <w:bCs/>
+          <w:color w:val="0000FF"/>
+        </w:rPr>
+        <w:t>}-node-group"</w:t>
+      </w:r>
+    </w:p>
+    <w:p>
+      <w:pPr>
+        <w:pStyle w:val="ListParagraph"/>
+        <w:rPr>
+          <w:b/>
+          <w:bCs/>
+          <w:color w:val="0000FF"/>
+        </w:rPr>
+      </w:pPr>
+      <w:r>
+        <w:rPr>
+          <w:b/>
+          <w:bCs/>
+          <w:color w:val="0000FF"/>
+        </w:rPr>
+        <w:t xml:space="preserve">  </w:t>
+      </w:r>
+      <w:proofErr w:type="spellStart"/>
+      <w:r>
+        <w:rPr>
+          <w:b/>
+          <w:bCs/>
+          <w:color w:val="0000FF"/>
+        </w:rPr>
+        <w:t>node_role_arn</w:t>
+      </w:r>
+      <w:proofErr w:type="spellEnd"/>
+      <w:r>
+        <w:rPr>
+          <w:b/>
+          <w:bCs/>
+          <w:color w:val="0000FF"/>
+        </w:rPr>
+        <w:t xml:space="preserve">   = </w:t>
+      </w:r>
+      <w:proofErr w:type="spellStart"/>
+      <w:r>
+        <w:rPr>
+          <w:b/>
+          <w:bCs/>
+          <w:color w:val="0000FF"/>
+        </w:rPr>
+        <w:t>aws_iam_role.eks_node_role.arn</w:t>
+      </w:r>
+      <w:proofErr w:type="spellEnd"/>
+    </w:p>
+    <w:p>
+      <w:pPr>
+        <w:pStyle w:val="ListParagraph"/>
+        <w:rPr>
+          <w:b/>
+          <w:bCs/>
+          <w:color w:val="0000FF"/>
+        </w:rPr>
+      </w:pPr>
+      <w:r>
+        <w:rPr>
+          <w:b/>
+          <w:bCs/>
+          <w:color w:val="0000FF"/>
+        </w:rPr>
+        <w:t xml:space="preserve">  </w:t>
+      </w:r>
+      <w:proofErr w:type="spellStart"/>
+      <w:r>
+        <w:rPr>
+          <w:b/>
+          <w:bCs/>
+          <w:color w:val="0000FF"/>
+        </w:rPr>
         <w:t>subnet_ids</w:t>
       </w:r>
       <w:proofErr w:type="spellEnd"/>
@@ -9383,189 +9489,25 @@
           <w:bCs/>
           <w:color w:val="0000FF"/>
         </w:rPr>
-        <w:t xml:space="preserve">              = </w:t>
-      </w:r>
-      <w:proofErr w:type="spellStart"/>
-      <w:r>
-        <w:rPr>
-          <w:b/>
-          <w:bCs/>
-          <w:color w:val="0000FF"/>
-        </w:rPr>
-        <w:t>concat</w:t>
-      </w:r>
-      <w:proofErr w:type="spellEnd"/>
-      <w:r>
-        <w:rPr>
-          <w:b/>
-          <w:bCs/>
-          <w:color w:val="0000FF"/>
-        </w:rPr>
-        <w:t>(</w:t>
-      </w:r>
-      <w:proofErr w:type="spellStart"/>
-      <w:r>
-        <w:rPr>
-          <w:b/>
-          <w:bCs/>
-          <w:color w:val="0000FF"/>
-        </w:rPr>
-        <w:t>aws_</w:t>
-      </w:r>
-      <w:proofErr w:type="gramStart"/>
-      <w:r>
-        <w:rPr>
-          <w:b/>
-          <w:bCs/>
-          <w:color w:val="0000FF"/>
-        </w:rPr>
-        <w:t>subnet.public</w:t>
-      </w:r>
-      <w:proofErr w:type="spellEnd"/>
-      <w:proofErr w:type="gramEnd"/>
-      <w:r>
-        <w:rPr>
-          <w:b/>
-          <w:bCs/>
-          <w:color w:val="0000FF"/>
-        </w:rPr>
-        <w:t xml:space="preserve">[*].id, </w:t>
-      </w:r>
-      <w:proofErr w:type="spellStart"/>
-      <w:r>
-        <w:rPr>
-          <w:b/>
-          <w:bCs/>
-          <w:color w:val="0000FF"/>
-        </w:rPr>
-        <w:t>aws_</w:t>
-      </w:r>
-      <w:proofErr w:type="gramStart"/>
-      <w:r>
-        <w:rPr>
-          <w:b/>
-          <w:bCs/>
-          <w:color w:val="0000FF"/>
-        </w:rPr>
-        <w:t>subnet.private</w:t>
-      </w:r>
-      <w:proofErr w:type="spellEnd"/>
-      <w:proofErr w:type="gramEnd"/>
-      <w:r>
-        <w:rPr>
-          <w:b/>
-          <w:bCs/>
-          <w:color w:val="0000FF"/>
-        </w:rPr>
-        <w:t>[*].id)</w:t>
-      </w:r>
-    </w:p>
-    <w:p>
-      <w:pPr>
-        <w:pStyle w:val="ListParagraph"/>
-        <w:rPr>
-          <w:b/>
-          <w:bCs/>
-          <w:color w:val="0000FF"/>
-        </w:rPr>
-      </w:pPr>
-      <w:r>
-        <w:rPr>
-          <w:b/>
-          <w:bCs/>
-          <w:color w:val="0000FF"/>
-        </w:rPr>
-        <w:t xml:space="preserve">    </w:t>
-      </w:r>
-      <w:proofErr w:type="spellStart"/>
-      <w:r>
-        <w:rPr>
-          <w:b/>
-          <w:bCs/>
-          <w:color w:val="0000FF"/>
-        </w:rPr>
-        <w:t>endpoint_private_access</w:t>
-      </w:r>
-      <w:proofErr w:type="spellEnd"/>
-      <w:r>
-        <w:rPr>
-          <w:b/>
-          <w:bCs/>
-          <w:color w:val="0000FF"/>
-        </w:rPr>
-        <w:t xml:space="preserve"> = true</w:t>
-      </w:r>
-    </w:p>
-    <w:p>
-      <w:pPr>
-        <w:pStyle w:val="ListParagraph"/>
-        <w:rPr>
-          <w:b/>
-          <w:bCs/>
-          <w:color w:val="0000FF"/>
-        </w:rPr>
-      </w:pPr>
-      <w:r>
-        <w:rPr>
-          <w:b/>
-          <w:bCs/>
-          <w:color w:val="0000FF"/>
-        </w:rPr>
-        <w:t xml:space="preserve">    </w:t>
-      </w:r>
-      <w:proofErr w:type="spellStart"/>
-      <w:r>
-        <w:rPr>
-          <w:b/>
-          <w:bCs/>
-          <w:color w:val="0000FF"/>
-        </w:rPr>
-        <w:t>endpoint_public_</w:t>
-      </w:r>
-      <w:proofErr w:type="gramStart"/>
-      <w:r>
-        <w:rPr>
-          <w:b/>
-          <w:bCs/>
-          <w:color w:val="0000FF"/>
-        </w:rPr>
-        <w:t>access</w:t>
-      </w:r>
-      <w:proofErr w:type="spellEnd"/>
-      <w:r>
-        <w:rPr>
-          <w:b/>
-          <w:bCs/>
-          <w:color w:val="0000FF"/>
-        </w:rPr>
-        <w:t xml:space="preserve">  =</w:t>
-      </w:r>
-      <w:proofErr w:type="gramEnd"/>
-      <w:r>
-        <w:rPr>
-          <w:b/>
-          <w:bCs/>
-          <w:color w:val="0000FF"/>
-        </w:rPr>
-        <w:t xml:space="preserve"> true</w:t>
-      </w:r>
-    </w:p>
-    <w:p>
-      <w:pPr>
-        <w:pStyle w:val="ListParagraph"/>
-        <w:rPr>
-          <w:b/>
-          <w:bCs/>
-          <w:color w:val="0000FF"/>
-        </w:rPr>
-      </w:pPr>
-      <w:r>
-        <w:rPr>
-          <w:b/>
-          <w:bCs/>
-          <w:color w:val="0000FF"/>
-        </w:rPr>
-        <w:t xml:space="preserve">  }</w:t>
+        <w:t xml:space="preserve">      = </w:t>
+      </w:r>
+      <w:proofErr w:type="spellStart"/>
+      <w:r>
+        <w:rPr>
+          <w:b/>
+          <w:bCs/>
+          <w:color w:val="0000FF"/>
+        </w:rPr>
+        <w:t>aws_subnet.private</w:t>
+      </w:r>
+      <w:proofErr w:type="spellEnd"/>
+      <w:r>
+        <w:rPr>
+          <w:b/>
+          <w:bCs/>
+          <w:color w:val="0000FF"/>
+        </w:rPr>
+        <w:t>[*].id</w:t>
       </w:r>
     </w:p>
     <w:p>
@@ -9602,7 +9544,43 @@
           <w:bCs/>
           <w:color w:val="0000FF"/>
         </w:rPr>
-        <w:t>enabled_cluster_log_types</w:t>
+        <w:t>capacity_type</w:t>
+      </w:r>
+      <w:proofErr w:type="spellEnd"/>
+      <w:r>
+        <w:rPr>
+          <w:b/>
+          <w:bCs/>
+          <w:color w:val="0000FF"/>
+        </w:rPr>
+        <w:t xml:space="preserve">  = "ON_DEMAND"</w:t>
+      </w:r>
+    </w:p>
+    <w:p>
+      <w:pPr>
+        <w:pStyle w:val="ListParagraph"/>
+        <w:rPr>
+          <w:b/>
+          <w:bCs/>
+          <w:color w:val="0000FF"/>
+        </w:rPr>
+      </w:pPr>
+      <w:r>
+        <w:rPr>
+          <w:b/>
+          <w:bCs/>
+          <w:color w:val="0000FF"/>
+        </w:rPr>
+        <w:t xml:space="preserve">  </w:t>
+      </w:r>
+      <w:proofErr w:type="spellStart"/>
+      <w:r>
+        <w:rPr>
+          <w:b/>
+          <w:bCs/>
+          <w:color w:val="0000FF"/>
+        </w:rPr>
+        <w:t>instance_types</w:t>
       </w:r>
       <w:proofErr w:type="spellEnd"/>
       <w:r>
@@ -9613,744 +9591,14 @@
         </w:rPr>
         <w:t xml:space="preserve"> = [</w:t>
       </w:r>
-    </w:p>
-    <w:p>
-      <w:pPr>
-        <w:pStyle w:val="ListParagraph"/>
-        <w:rPr>
-          <w:b/>
-          <w:bCs/>
-          <w:color w:val="0000FF"/>
-        </w:rPr>
-      </w:pPr>
-      <w:r>
-        <w:rPr>
-          <w:b/>
-          <w:bCs/>
-          <w:color w:val="0000FF"/>
-        </w:rPr>
-        <w:t xml:space="preserve">    "</w:t>
-      </w:r>
-      <w:proofErr w:type="spellStart"/>
-      <w:r>
-        <w:rPr>
-          <w:b/>
-          <w:bCs/>
-          <w:color w:val="0000FF"/>
-        </w:rPr>
-        <w:t>api</w:t>
-      </w:r>
-      <w:proofErr w:type="spellEnd"/>
-      <w:r>
-        <w:rPr>
-          <w:b/>
-          <w:bCs/>
-          <w:color w:val="0000FF"/>
-        </w:rPr>
-        <w:t>",</w:t>
-      </w:r>
-    </w:p>
-    <w:p>
-      <w:pPr>
-        <w:pStyle w:val="ListParagraph"/>
-        <w:rPr>
-          <w:b/>
-          <w:bCs/>
-          <w:color w:val="0000FF"/>
-        </w:rPr>
-      </w:pPr>
-      <w:r>
-        <w:rPr>
-          <w:b/>
-          <w:bCs/>
-          <w:color w:val="0000FF"/>
-        </w:rPr>
-        <w:t xml:space="preserve">    "audit",</w:t>
-      </w:r>
-    </w:p>
-    <w:p>
-      <w:pPr>
-        <w:pStyle w:val="ListParagraph"/>
-        <w:rPr>
-          <w:b/>
-          <w:bCs/>
-          <w:color w:val="0000FF"/>
-        </w:rPr>
-      </w:pPr>
-      <w:r>
-        <w:rPr>
-          <w:b/>
-          <w:bCs/>
-          <w:color w:val="0000FF"/>
-        </w:rPr>
-        <w:t xml:space="preserve">    "authenticator",</w:t>
-      </w:r>
-    </w:p>
-    <w:p>
-      <w:pPr>
-        <w:pStyle w:val="ListParagraph"/>
-        <w:rPr>
-          <w:b/>
-          <w:bCs/>
-          <w:color w:val="0000FF"/>
-        </w:rPr>
-      </w:pPr>
-      <w:r>
-        <w:rPr>
-          <w:b/>
-          <w:bCs/>
-          <w:color w:val="0000FF"/>
-        </w:rPr>
-        <w:t xml:space="preserve">    "</w:t>
-      </w:r>
-      <w:proofErr w:type="spellStart"/>
-      <w:r>
-        <w:rPr>
-          <w:b/>
-          <w:bCs/>
-          <w:color w:val="0000FF"/>
-        </w:rPr>
-        <w:t>controllerManager</w:t>
-      </w:r>
-      <w:proofErr w:type="spellEnd"/>
-      <w:r>
-        <w:rPr>
-          <w:b/>
-          <w:bCs/>
-          <w:color w:val="0000FF"/>
-        </w:rPr>
-        <w:t>",</w:t>
-      </w:r>
-    </w:p>
-    <w:p>
-      <w:pPr>
-        <w:pStyle w:val="ListParagraph"/>
-        <w:rPr>
-          <w:b/>
-          <w:bCs/>
-          <w:color w:val="0000FF"/>
-        </w:rPr>
-      </w:pPr>
-      <w:r>
-        <w:rPr>
-          <w:b/>
-          <w:bCs/>
-          <w:color w:val="0000FF"/>
-        </w:rPr>
-        <w:t xml:space="preserve">    "scheduler"</w:t>
-      </w:r>
-    </w:p>
-    <w:p>
-      <w:pPr>
-        <w:pStyle w:val="ListParagraph"/>
-        <w:rPr>
-          <w:b/>
-          <w:bCs/>
-          <w:color w:val="0000FF"/>
-        </w:rPr>
-      </w:pPr>
-      <w:r>
-        <w:rPr>
-          <w:b/>
-          <w:bCs/>
-          <w:color w:val="0000FF"/>
-        </w:rPr>
-        <w:t xml:space="preserve">  ]</w:t>
-      </w:r>
-    </w:p>
-    <w:p>
-      <w:pPr>
-        <w:pStyle w:val="ListParagraph"/>
-        <w:rPr>
-          <w:b/>
-          <w:bCs/>
-          <w:color w:val="0000FF"/>
-        </w:rPr>
-      </w:pPr>
-    </w:p>
-    <w:p>
-      <w:pPr>
-        <w:pStyle w:val="ListParagraph"/>
-        <w:rPr>
-          <w:b/>
-          <w:bCs/>
-          <w:color w:val="0000FF"/>
-        </w:rPr>
-      </w:pPr>
-      <w:r>
-        <w:rPr>
-          <w:b/>
-          <w:bCs/>
-          <w:color w:val="0000FF"/>
-        </w:rPr>
-        <w:t xml:space="preserve">  </w:t>
-      </w:r>
-      <w:proofErr w:type="spellStart"/>
-      <w:r>
-        <w:rPr>
-          <w:b/>
-          <w:bCs/>
-          <w:color w:val="0000FF"/>
-        </w:rPr>
-        <w:t>depends_on</w:t>
-      </w:r>
-      <w:proofErr w:type="spellEnd"/>
-      <w:r>
-        <w:rPr>
-          <w:b/>
-          <w:bCs/>
-          <w:color w:val="0000FF"/>
-        </w:rPr>
-        <w:t xml:space="preserve"> = [</w:t>
-      </w:r>
-    </w:p>
-    <w:p>
-      <w:pPr>
-        <w:pStyle w:val="ListParagraph"/>
-        <w:rPr>
-          <w:b/>
-          <w:bCs/>
-          <w:color w:val="0000FF"/>
-        </w:rPr>
-      </w:pPr>
-      <w:r>
-        <w:rPr>
-          <w:b/>
-          <w:bCs/>
-          <w:color w:val="0000FF"/>
-        </w:rPr>
-        <w:t xml:space="preserve">    </w:t>
-      </w:r>
-      <w:proofErr w:type="spellStart"/>
-      <w:r>
-        <w:rPr>
-          <w:b/>
-          <w:bCs/>
-          <w:color w:val="0000FF"/>
-        </w:rPr>
-        <w:t>aws_iam_role_policy_attachment.eks_cluster_policy</w:t>
-      </w:r>
-      <w:proofErr w:type="spellEnd"/>
-    </w:p>
-    <w:p>
-      <w:pPr>
-        <w:pStyle w:val="ListParagraph"/>
-        <w:rPr>
-          <w:b/>
-          <w:bCs/>
-          <w:color w:val="0000FF"/>
-        </w:rPr>
-      </w:pPr>
-      <w:r>
-        <w:rPr>
-          <w:b/>
-          <w:bCs/>
-          <w:color w:val="0000FF"/>
-        </w:rPr>
-        <w:t xml:space="preserve">  ]</w:t>
-      </w:r>
-    </w:p>
-    <w:p>
-      <w:pPr>
-        <w:pStyle w:val="ListParagraph"/>
-        <w:rPr>
-          <w:b/>
-          <w:bCs/>
-          <w:color w:val="0000FF"/>
-        </w:rPr>
-      </w:pPr>
-    </w:p>
-    <w:p>
-      <w:pPr>
-        <w:pStyle w:val="ListParagraph"/>
-        <w:rPr>
-          <w:b/>
-          <w:bCs/>
-          <w:color w:val="0000FF"/>
-        </w:rPr>
-      </w:pPr>
-      <w:r>
-        <w:rPr>
-          <w:b/>
-          <w:bCs/>
-          <w:color w:val="0000FF"/>
-        </w:rPr>
-        <w:t xml:space="preserve">  tags = </w:t>
-      </w:r>
-      <w:proofErr w:type="gramStart"/>
-      <w:r>
-        <w:rPr>
-          <w:b/>
-          <w:bCs/>
-          <w:color w:val="0000FF"/>
-        </w:rPr>
-        <w:t>merge(</w:t>
-      </w:r>
-      <w:proofErr w:type="spellStart"/>
-      <w:r>
-        <w:rPr>
-          <w:b/>
-          <w:bCs/>
-          <w:color w:val="0000FF"/>
-        </w:rPr>
-        <w:t>local.common</w:t>
-      </w:r>
-      <w:proofErr w:type="gramEnd"/>
-      <w:r>
-        <w:rPr>
-          <w:b/>
-          <w:bCs/>
-          <w:color w:val="0000FF"/>
-        </w:rPr>
-        <w:t>_tags</w:t>
-      </w:r>
-      <w:proofErr w:type="spellEnd"/>
-      <w:r>
-        <w:rPr>
-          <w:b/>
-          <w:bCs/>
-          <w:color w:val="0000FF"/>
-        </w:rPr>
-        <w:t>, {</w:t>
-      </w:r>
-    </w:p>
-    <w:p>
-      <w:pPr>
-        <w:pStyle w:val="ListParagraph"/>
-        <w:rPr>
-          <w:b/>
-          <w:bCs/>
-          <w:color w:val="0000FF"/>
-        </w:rPr>
-      </w:pPr>
-      <w:r>
-        <w:rPr>
-          <w:b/>
-          <w:bCs/>
-          <w:color w:val="0000FF"/>
-        </w:rPr>
-        <w:t xml:space="preserve">    Name = </w:t>
-      </w:r>
-      <w:proofErr w:type="spellStart"/>
-      <w:r>
-        <w:rPr>
-          <w:b/>
-          <w:bCs/>
-          <w:color w:val="0000FF"/>
-        </w:rPr>
-        <w:t>var.eks_cluster_name</w:t>
-      </w:r>
-      <w:proofErr w:type="spellEnd"/>
-    </w:p>
-    <w:p>
-      <w:pPr>
-        <w:pStyle w:val="ListParagraph"/>
-        <w:rPr>
-          <w:b/>
-          <w:bCs/>
-          <w:color w:val="0000FF"/>
-        </w:rPr>
-      </w:pPr>
-      <w:r>
-        <w:rPr>
-          <w:b/>
-          <w:bCs/>
-          <w:color w:val="0000FF"/>
-        </w:rPr>
-        <w:t xml:space="preserve">  })</w:t>
-      </w:r>
-    </w:p>
-    <w:p>
-      <w:pPr>
-        <w:pStyle w:val="ListParagraph"/>
-        <w:rPr>
-          <w:b/>
-          <w:bCs/>
-          <w:color w:val="0000FF"/>
-        </w:rPr>
-      </w:pPr>
-      <w:r>
-        <w:rPr>
-          <w:b/>
-          <w:bCs/>
-          <w:color w:val="0000FF"/>
-        </w:rPr>
-        <w:t>}</w:t>
-      </w:r>
-    </w:p>
-    <w:p>
-      <w:pPr>
-        <w:pStyle w:val="ListParagraph"/>
-        <w:rPr>
-          <w:b/>
-          <w:bCs/>
-          <w:color w:val="0000FF"/>
-        </w:rPr>
-      </w:pPr>
-    </w:p>
-    <w:p>
-      <w:pPr>
-        <w:pStyle w:val="ListParagraph"/>
-        <w:rPr>
-          <w:b/>
-          <w:bCs/>
-          <w:color w:val="0000FF"/>
-        </w:rPr>
-      </w:pPr>
-      <w:r>
-        <w:rPr>
-          <w:b/>
-          <w:bCs/>
-          <w:color w:val="0000FF"/>
-        </w:rPr>
-        <w:t>resource "</w:t>
-      </w:r>
-      <w:proofErr w:type="spellStart"/>
-      <w:r>
-        <w:rPr>
-          <w:b/>
-          <w:bCs/>
-          <w:color w:val="0000FF"/>
-        </w:rPr>
-        <w:t>aws_eks_node_group</w:t>
-      </w:r>
-      <w:proofErr w:type="spellEnd"/>
-      <w:r>
-        <w:rPr>
-          <w:b/>
-          <w:bCs/>
-          <w:color w:val="0000FF"/>
-        </w:rPr>
-        <w:t>" "main" {</w:t>
-      </w:r>
-    </w:p>
-    <w:p>
-      <w:pPr>
-        <w:pStyle w:val="ListParagraph"/>
-        <w:rPr>
-          <w:b/>
-          <w:bCs/>
-          <w:color w:val="0000FF"/>
-        </w:rPr>
-      </w:pPr>
-      <w:r>
-        <w:rPr>
-          <w:b/>
-          <w:bCs/>
-          <w:color w:val="0000FF"/>
-        </w:rPr>
-        <w:t xml:space="preserve">  </w:t>
-      </w:r>
-      <w:proofErr w:type="spellStart"/>
-      <w:r>
-        <w:rPr>
-          <w:b/>
-          <w:bCs/>
-          <w:color w:val="0000FF"/>
-        </w:rPr>
-        <w:t>cluster_name</w:t>
-      </w:r>
-      <w:proofErr w:type="spellEnd"/>
-      <w:r>
-        <w:rPr>
-          <w:b/>
-          <w:bCs/>
-          <w:color w:val="0000FF"/>
-        </w:rPr>
-        <w:t xml:space="preserve">    = aws_eks_cluster.main.name</w:t>
-      </w:r>
-    </w:p>
-    <w:p>
-      <w:pPr>
-        <w:pStyle w:val="ListParagraph"/>
-        <w:rPr>
-          <w:b/>
-          <w:bCs/>
-          <w:color w:val="0000FF"/>
-        </w:rPr>
-      </w:pPr>
-      <w:r>
-        <w:rPr>
-          <w:b/>
-          <w:bCs/>
-          <w:color w:val="0000FF"/>
-        </w:rPr>
-        <w:t xml:space="preserve">  </w:t>
-      </w:r>
-      <w:proofErr w:type="spellStart"/>
-      <w:r>
-        <w:rPr>
-          <w:b/>
-          <w:bCs/>
-          <w:color w:val="0000FF"/>
-        </w:rPr>
-        <w:t>node_group_name</w:t>
-      </w:r>
-      <w:proofErr w:type="spellEnd"/>
-      <w:r>
-        <w:rPr>
-          <w:b/>
-          <w:bCs/>
-          <w:color w:val="0000FF"/>
-        </w:rPr>
-        <w:t xml:space="preserve"> = "${</w:t>
-      </w:r>
-      <w:proofErr w:type="spellStart"/>
-      <w:proofErr w:type="gramStart"/>
-      <w:r>
-        <w:rPr>
-          <w:b/>
-          <w:bCs/>
-          <w:color w:val="0000FF"/>
-        </w:rPr>
-        <w:t>var.project</w:t>
-      </w:r>
-      <w:proofErr w:type="gramEnd"/>
-      <w:r>
-        <w:rPr>
-          <w:b/>
-          <w:bCs/>
-          <w:color w:val="0000FF"/>
-        </w:rPr>
-        <w:t>_name</w:t>
-      </w:r>
-      <w:proofErr w:type="spellEnd"/>
-      <w:r>
-        <w:rPr>
-          <w:b/>
-          <w:bCs/>
-          <w:color w:val="0000FF"/>
-        </w:rPr>
-        <w:t>}-node-group"</w:t>
-      </w:r>
-    </w:p>
-    <w:p>
-      <w:pPr>
-        <w:pStyle w:val="ListParagraph"/>
-        <w:rPr>
-          <w:b/>
-          <w:bCs/>
-          <w:color w:val="0000FF"/>
-        </w:rPr>
-      </w:pPr>
-      <w:r>
-        <w:rPr>
-          <w:b/>
-          <w:bCs/>
-          <w:color w:val="0000FF"/>
-        </w:rPr>
-        <w:t xml:space="preserve">  </w:t>
-      </w:r>
-      <w:proofErr w:type="spellStart"/>
-      <w:r>
-        <w:rPr>
-          <w:b/>
-          <w:bCs/>
-          <w:color w:val="0000FF"/>
-        </w:rPr>
-        <w:t>node_role_arn</w:t>
-      </w:r>
-      <w:proofErr w:type="spellEnd"/>
-      <w:r>
-        <w:rPr>
-          <w:b/>
-          <w:bCs/>
-          <w:color w:val="0000FF"/>
-        </w:rPr>
-        <w:t xml:space="preserve">   = </w:t>
-      </w:r>
-      <w:proofErr w:type="spellStart"/>
-      <w:r>
-        <w:rPr>
-          <w:b/>
-          <w:bCs/>
-          <w:color w:val="0000FF"/>
-        </w:rPr>
-        <w:t>aws_iam_role.eks_node_role.arn</w:t>
-      </w:r>
-      <w:proofErr w:type="spellEnd"/>
-    </w:p>
-    <w:p>
-      <w:pPr>
-        <w:pStyle w:val="ListParagraph"/>
-        <w:rPr>
-          <w:b/>
-          <w:bCs/>
-          <w:color w:val="0000FF"/>
-        </w:rPr>
-      </w:pPr>
-      <w:r>
-        <w:rPr>
-          <w:b/>
-          <w:bCs/>
-          <w:color w:val="0000FF"/>
-        </w:rPr>
-        <w:t xml:space="preserve">  </w:t>
-      </w:r>
-      <w:proofErr w:type="spellStart"/>
-      <w:r>
-        <w:rPr>
-          <w:b/>
-          <w:bCs/>
-          <w:color w:val="0000FF"/>
-        </w:rPr>
-        <w:t>subnet_ids</w:t>
-      </w:r>
-      <w:proofErr w:type="spellEnd"/>
-      <w:r>
-        <w:rPr>
-          <w:b/>
-          <w:bCs/>
-          <w:color w:val="0000FF"/>
-        </w:rPr>
-        <w:t xml:space="preserve">      = </w:t>
-      </w:r>
-      <w:proofErr w:type="spellStart"/>
-      <w:r>
-        <w:rPr>
-          <w:b/>
-          <w:bCs/>
-          <w:color w:val="0000FF"/>
-        </w:rPr>
-        <w:t>aws_</w:t>
-      </w:r>
-      <w:proofErr w:type="gramStart"/>
-      <w:r>
-        <w:rPr>
-          <w:b/>
-          <w:bCs/>
-          <w:color w:val="0000FF"/>
-        </w:rPr>
-        <w:t>subnet.private</w:t>
-      </w:r>
-      <w:proofErr w:type="spellEnd"/>
-      <w:proofErr w:type="gramEnd"/>
-      <w:r>
-        <w:rPr>
-          <w:b/>
-          <w:bCs/>
-          <w:color w:val="0000FF"/>
-        </w:rPr>
-        <w:t>[*].id</w:t>
-      </w:r>
-    </w:p>
-    <w:p>
-      <w:pPr>
-        <w:pStyle w:val="ListParagraph"/>
-        <w:rPr>
-          <w:b/>
-          <w:bCs/>
-          <w:color w:val="0000FF"/>
-        </w:rPr>
-      </w:pPr>
-    </w:p>
-    <w:p>
-      <w:pPr>
-        <w:pStyle w:val="ListParagraph"/>
-        <w:rPr>
-          <w:b/>
-          <w:bCs/>
-          <w:color w:val="0000FF"/>
-        </w:rPr>
-      </w:pPr>
-      <w:r>
-        <w:rPr>
-          <w:b/>
-          <w:bCs/>
-          <w:color w:val="0000FF"/>
-        </w:rPr>
-        <w:t xml:space="preserve">  </w:t>
-      </w:r>
-      <w:proofErr w:type="spellStart"/>
-      <w:r>
-        <w:rPr>
-          <w:b/>
-          <w:bCs/>
-          <w:color w:val="0000FF"/>
-        </w:rPr>
-        <w:t>capacity_</w:t>
-      </w:r>
-      <w:proofErr w:type="gramStart"/>
-      <w:r>
-        <w:rPr>
-          <w:b/>
-          <w:bCs/>
-          <w:color w:val="0000FF"/>
-        </w:rPr>
-        <w:t>type</w:t>
-      </w:r>
-      <w:proofErr w:type="spellEnd"/>
-      <w:r>
-        <w:rPr>
-          <w:b/>
-          <w:bCs/>
-          <w:color w:val="0000FF"/>
-        </w:rPr>
-        <w:t xml:space="preserve">  =</w:t>
-      </w:r>
-      <w:proofErr w:type="gramEnd"/>
-      <w:r>
-        <w:rPr>
-          <w:b/>
-          <w:bCs/>
-          <w:color w:val="0000FF"/>
-        </w:rPr>
-        <w:t xml:space="preserve"> "ON_DEMAND"</w:t>
-      </w:r>
-    </w:p>
-    <w:p>
-      <w:pPr>
-        <w:pStyle w:val="ListParagraph"/>
-        <w:rPr>
-          <w:b/>
-          <w:bCs/>
-          <w:color w:val="0000FF"/>
-        </w:rPr>
-      </w:pPr>
-      <w:r>
-        <w:rPr>
-          <w:b/>
-          <w:bCs/>
-          <w:color w:val="0000FF"/>
-        </w:rPr>
-        <w:t xml:space="preserve">  </w:t>
-      </w:r>
-      <w:proofErr w:type="spellStart"/>
-      <w:r>
-        <w:rPr>
-          <w:b/>
-          <w:bCs/>
-          <w:color w:val="0000FF"/>
-        </w:rPr>
-        <w:t>instance_types</w:t>
-      </w:r>
-      <w:proofErr w:type="spellEnd"/>
-      <w:r>
-        <w:rPr>
-          <w:b/>
-          <w:bCs/>
-          <w:color w:val="0000FF"/>
-        </w:rPr>
-        <w:t xml:space="preserve"> = [</w:t>
-      </w:r>
-      <w:proofErr w:type="spellStart"/>
-      <w:proofErr w:type="gramStart"/>
-      <w:r>
-        <w:rPr>
-          <w:b/>
-          <w:bCs/>
-          <w:color w:val="0000FF"/>
-        </w:rPr>
-        <w:t>var.node</w:t>
-      </w:r>
-      <w:proofErr w:type="gramEnd"/>
-      <w:r>
-        <w:rPr>
-          <w:b/>
-          <w:bCs/>
-          <w:color w:val="0000FF"/>
-        </w:rPr>
-        <w:t>_instance_type</w:t>
+      <w:proofErr w:type="spellStart"/>
+      <w:r>
+        <w:rPr>
+          <w:b/>
+          <w:bCs/>
+          <w:color w:val="0000FF"/>
+        </w:rPr>
+        <w:t>var.node_instance_type</w:t>
       </w:r>
       <w:proofErr w:type="spellEnd"/>
       <w:r>
@@ -10445,23 +9693,13 @@
         <w:t xml:space="preserve"> = </w:t>
       </w:r>
       <w:proofErr w:type="spellStart"/>
-      <w:proofErr w:type="gramStart"/>
-      <w:r>
-        <w:rPr>
-          <w:b/>
-          <w:bCs/>
-          <w:color w:val="0000FF"/>
-        </w:rPr>
-        <w:t>var.desired</w:t>
-      </w:r>
-      <w:proofErr w:type="gramEnd"/>
-      <w:r>
-        <w:rPr>
-          <w:b/>
-          <w:bCs/>
-          <w:color w:val="0000FF"/>
-        </w:rPr>
-        <w:t>_node_count</w:t>
+      <w:r>
+        <w:rPr>
+          <w:b/>
+          <w:bCs/>
+          <w:color w:val="0000FF"/>
+        </w:rPr>
+        <w:t>var.desired_node_count</w:t>
       </w:r>
       <w:proofErr w:type="spellEnd"/>
     </w:p>
@@ -10625,25 +9863,7 @@
           <w:bCs/>
           <w:color w:val="0000FF"/>
         </w:rPr>
-        <w:t>aws_iam_role_policy_</w:t>
-      </w:r>
-      <w:proofErr w:type="gramStart"/>
-      <w:r>
-        <w:rPr>
-          <w:b/>
-          <w:bCs/>
-          <w:color w:val="0000FF"/>
-        </w:rPr>
-        <w:t>attachment.worker</w:t>
-      </w:r>
-      <w:proofErr w:type="gramEnd"/>
-      <w:r>
-        <w:rPr>
-          <w:b/>
-          <w:bCs/>
-          <w:color w:val="0000FF"/>
-        </w:rPr>
-        <w:t>_node_policy</w:t>
+        <w:t>aws_iam_role_policy_attachment.worker_node_policy</w:t>
       </w:r>
       <w:proofErr w:type="spellEnd"/>
       <w:r>
@@ -10762,34 +9982,16 @@
           <w:bCs/>
           <w:color w:val="0000FF"/>
         </w:rPr>
-        <w:t xml:space="preserve">  tags = </w:t>
-      </w:r>
-      <w:proofErr w:type="gramStart"/>
-      <w:r>
-        <w:rPr>
-          <w:b/>
-          <w:bCs/>
-          <w:color w:val="0000FF"/>
-        </w:rPr>
-        <w:t>merge(</w:t>
-      </w:r>
-      <w:proofErr w:type="spellStart"/>
-      <w:r>
-        <w:rPr>
-          <w:b/>
-          <w:bCs/>
-          <w:color w:val="0000FF"/>
-        </w:rPr>
-        <w:t>local.common</w:t>
-      </w:r>
-      <w:proofErr w:type="gramEnd"/>
-      <w:r>
-        <w:rPr>
-          <w:b/>
-          <w:bCs/>
-          <w:color w:val="0000FF"/>
-        </w:rPr>
-        <w:t>_tags</w:t>
+        <w:t xml:space="preserve">  tags = merge(</w:t>
+      </w:r>
+      <w:proofErr w:type="spellStart"/>
+      <w:r>
+        <w:rPr>
+          <w:b/>
+          <w:bCs/>
+          <w:color w:val="0000FF"/>
+        </w:rPr>
+        <w:t>local.common_tags</w:t>
       </w:r>
       <w:proofErr w:type="spellEnd"/>
       <w:r>
@@ -10819,23 +10021,13 @@
         <w:t xml:space="preserve">    Name = "${</w:t>
       </w:r>
       <w:proofErr w:type="spellStart"/>
-      <w:proofErr w:type="gramStart"/>
-      <w:r>
-        <w:rPr>
-          <w:b/>
-          <w:bCs/>
-          <w:color w:val="0000FF"/>
-        </w:rPr>
-        <w:t>var.project</w:t>
-      </w:r>
-      <w:proofErr w:type="gramEnd"/>
-      <w:r>
-        <w:rPr>
-          <w:b/>
-          <w:bCs/>
-          <w:color w:val="0000FF"/>
-        </w:rPr>
-        <w:t>_name</w:t>
+      <w:r>
+        <w:rPr>
+          <w:b/>
+          <w:bCs/>
+          <w:color w:val="0000FF"/>
+        </w:rPr>
+        <w:t>var.project_name</w:t>
       </w:r>
       <w:proofErr w:type="spellEnd"/>
       <w:r>
@@ -11212,23 +10404,13 @@
         <w:t xml:space="preserve">  value       = </w:t>
       </w:r>
       <w:proofErr w:type="spellStart"/>
-      <w:proofErr w:type="gramStart"/>
-      <w:r>
-        <w:rPr>
-          <w:b/>
-          <w:bCs/>
-          <w:color w:val="0000FF"/>
-        </w:rPr>
-        <w:t>aws_ecr_repository.app.repository</w:t>
-      </w:r>
-      <w:proofErr w:type="gramEnd"/>
-      <w:r>
-        <w:rPr>
-          <w:b/>
-          <w:bCs/>
-          <w:color w:val="0000FF"/>
-        </w:rPr>
-        <w:t>_url</w:t>
+      <w:r>
+        <w:rPr>
+          <w:b/>
+          <w:bCs/>
+          <w:color w:val="0000FF"/>
+        </w:rPr>
+        <w:t>aws_ecr_repository.app.repository_url</w:t>
       </w:r>
       <w:proofErr w:type="spellEnd"/>
     </w:p>
@@ -11338,19 +10520,9 @@
           <w:bCs/>
           <w:color w:val="0000FF"/>
         </w:rPr>
-        <w:t>aws_</w:t>
-      </w:r>
-      <w:proofErr w:type="gramStart"/>
-      <w:r>
-        <w:rPr>
-          <w:b/>
-          <w:bCs/>
-          <w:color w:val="0000FF"/>
-        </w:rPr>
-        <w:t>subnet.public</w:t>
-      </w:r>
-      <w:proofErr w:type="spellEnd"/>
-      <w:proofErr w:type="gramEnd"/>
+        <w:t>aws_subnet.public</w:t>
+      </w:r>
+      <w:proofErr w:type="spellEnd"/>
       <w:r>
         <w:rPr>
           <w:b/>
@@ -11467,19 +10639,9 @@
           <w:bCs/>
           <w:color w:val="0000FF"/>
         </w:rPr>
-        <w:t>aws_</w:t>
-      </w:r>
-      <w:proofErr w:type="gramStart"/>
-      <w:r>
-        <w:rPr>
-          <w:b/>
-          <w:bCs/>
-          <w:color w:val="0000FF"/>
-        </w:rPr>
-        <w:t>subnet.private</w:t>
-      </w:r>
-      <w:proofErr w:type="spellEnd"/>
-      <w:proofErr w:type="gramEnd"/>
+        <w:t>aws_subnet.private</w:t>
+      </w:r>
+      <w:proofErr w:type="spellEnd"/>
       <w:r>
         <w:rPr>
           <w:b/>
@@ -12205,18 +11367,8 @@
           <w:bCs/>
           <w:color w:val="0000FF"/>
         </w:rPr>
-        <w:t>cd</w:t>
-      </w:r>
-      <w:proofErr w:type="gramStart"/>
-      <w:r>
-        <w:rPr>
-          <w:b/>
-          <w:bCs/>
-          <w:color w:val="0000FF"/>
-        </w:rPr>
-        <w:t xml:space="preserve"> ..</w:t>
-      </w:r>
-      <w:proofErr w:type="gramEnd"/>
+        <w:t>cd ..</w:t>
+      </w:r>
     </w:p>
     <w:p>
       <w:r>
@@ -12435,25 +11587,7 @@
           <w:bCs/>
           <w:color w:val="0000FF"/>
         </w:rPr>
-        <w:t>nginx-</w:t>
-      </w:r>
-      <w:proofErr w:type="gramStart"/>
-      <w:r>
-        <w:rPr>
-          <w:b/>
-          <w:bCs/>
-          <w:color w:val="0000FF"/>
-        </w:rPr>
-        <w:t>unprivileged:stable</w:t>
-      </w:r>
-      <w:proofErr w:type="gramEnd"/>
-      <w:r>
-        <w:rPr>
-          <w:b/>
-          <w:bCs/>
-          <w:color w:val="0000FF"/>
-        </w:rPr>
-        <w:t>-alpine</w:t>
+        <w:t>nginx-unprivileged:stable-alpine</w:t>
       </w:r>
       <w:proofErr w:type="spellEnd"/>
     </w:p>
@@ -12584,25 +11718,7 @@
           <w:bCs/>
           <w:color w:val="0000FF"/>
         </w:rPr>
-        <w:t xml:space="preserve">cd </w:t>
-      </w:r>
-      <w:proofErr w:type="gramStart"/>
-      <w:r>
-        <w:rPr>
-          <w:b/>
-          <w:bCs/>
-          <w:color w:val="0000FF"/>
-        </w:rPr>
-        <w:t>terraform</w:t>
-      </w:r>
-      <w:proofErr w:type="gramEnd"/>
-      <w:r>
-        <w:rPr>
-          <w:b/>
-          <w:bCs/>
-          <w:color w:val="0000FF"/>
-        </w:rPr>
-        <w:t xml:space="preserve"> &amp;&amp; export ECR_URL=$(terraform output -raw </w:t>
+        <w:t xml:space="preserve">cd terraform &amp;&amp; export ECR_URL=$(terraform output -raw </w:t>
       </w:r>
       <w:proofErr w:type="spellStart"/>
       <w:r>
@@ -12620,18 +11736,8 @@
           <w:bCs/>
           <w:color w:val="0000FF"/>
         </w:rPr>
-        <w:t>) &amp;&amp; cd</w:t>
-      </w:r>
-      <w:proofErr w:type="gramStart"/>
-      <w:r>
-        <w:rPr>
-          <w:b/>
-          <w:bCs/>
-          <w:color w:val="0000FF"/>
-        </w:rPr>
-        <w:t xml:space="preserve"> ..</w:t>
-      </w:r>
-      <w:proofErr w:type="gramEnd"/>
+        <w:t>) &amp;&amp; cd ..</w:t>
+      </w:r>
     </w:p>
     <w:p>
       <w:r>
@@ -12850,25 +11956,7 @@
           <w:bCs/>
           <w:color w:val="0000FF"/>
         </w:rPr>
-        <w:t>-security-</w:t>
-      </w:r>
-      <w:proofErr w:type="gramStart"/>
-      <w:r>
-        <w:rPr>
-          <w:b/>
-          <w:bCs/>
-          <w:color w:val="0000FF"/>
-        </w:rPr>
-        <w:t>app .</w:t>
-      </w:r>
-      <w:proofErr w:type="gramEnd"/>
-      <w:r>
-        <w:rPr>
-          <w:b/>
-          <w:bCs/>
-          <w:color w:val="0000FF"/>
-        </w:rPr>
-        <w:t>/</w:t>
+        <w:t>-security-app ./</w:t>
       </w:r>
       <w:proofErr w:type="spellStart"/>
       <w:r>
@@ -13019,19 +12107,9 @@
           <w:bCs/>
           <w:color w:val="0000FF"/>
         </w:rPr>
-        <w:t>enterprise-eks-security-</w:t>
-      </w:r>
-      <w:proofErr w:type="gramStart"/>
-      <w:r>
-        <w:rPr>
-          <w:b/>
-          <w:bCs/>
-          <w:color w:val="0000FF"/>
-        </w:rPr>
-        <w:t>app:latest</w:t>
-      </w:r>
-      <w:proofErr w:type="spellEnd"/>
-      <w:proofErr w:type="gramEnd"/>
+        <w:t>enterprise-eks-security-app:latest</w:t>
+      </w:r>
+      <w:proofErr w:type="spellEnd"/>
       <w:r>
         <w:rPr>
           <w:b/>
@@ -13047,19 +12125,9 @@
           <w:bCs/>
           <w:color w:val="0000FF"/>
         </w:rPr>
-        <w:t>ECR_</w:t>
-      </w:r>
-      <w:proofErr w:type="gramStart"/>
-      <w:r>
-        <w:rPr>
-          <w:b/>
-          <w:bCs/>
-          <w:color w:val="0000FF"/>
-        </w:rPr>
-        <w:t>URL:latest</w:t>
-      </w:r>
-      <w:proofErr w:type="spellEnd"/>
-      <w:proofErr w:type="gramEnd"/>
+        <w:t>ECR_URL:latest</w:t>
+      </w:r>
+      <w:proofErr w:type="spellEnd"/>
     </w:p>
     <w:p>
       <w:r>
@@ -13136,19 +12204,9 @@
           <w:bCs/>
           <w:color w:val="0000FF"/>
         </w:rPr>
-        <w:t>ECR_</w:t>
-      </w:r>
-      <w:proofErr w:type="gramStart"/>
-      <w:r>
-        <w:rPr>
-          <w:b/>
-          <w:bCs/>
-          <w:color w:val="0000FF"/>
-        </w:rPr>
-        <w:t>URL:latest</w:t>
-      </w:r>
-      <w:proofErr w:type="spellEnd"/>
-      <w:proofErr w:type="gramEnd"/>
+        <w:t>ECR_URL:latest</w:t>
+      </w:r>
+      <w:proofErr w:type="spellEnd"/>
     </w:p>
     <w:p>
       <w:pPr>
@@ -14251,18 +13309,8 @@
           <w:bCs/>
           <w:color w:val="0000FF"/>
         </w:rPr>
-        <w:t>          image: 727646499790.dkr.ecr.us-east-1.amazonaws.com/enterprise-eks-security-</w:t>
-      </w:r>
-      <w:proofErr w:type="gramStart"/>
-      <w:r>
-        <w:rPr>
-          <w:b/>
-          <w:bCs/>
-          <w:color w:val="0000FF"/>
-        </w:rPr>
-        <w:t>app:latest</w:t>
-      </w:r>
-      <w:proofErr w:type="gramEnd"/>
+        <w:t>          image: 727646499790.dkr.ecr.us-east-1.amazonaws.com/enterprise-eks-security-app:latest</w:t>
+      </w:r>
     </w:p>
     <w:p>
       <w:pPr>
@@ -16430,25 +15478,7 @@
           <w:bCs/>
           <w:color w:val="0000FF"/>
         </w:rPr>
-        <w:t xml:space="preserve">helm repo </w:t>
-      </w:r>
-      <w:proofErr w:type="gramStart"/>
-      <w:r>
-        <w:rPr>
-          <w:b/>
-          <w:bCs/>
-          <w:color w:val="0000FF"/>
-        </w:rPr>
-        <w:t>add</w:t>
-      </w:r>
-      <w:proofErr w:type="gramEnd"/>
-      <w:r>
-        <w:rPr>
-          <w:b/>
-          <w:bCs/>
-          <w:color w:val="0000FF"/>
-        </w:rPr>
-        <w:t xml:space="preserve"> ingress-nginx https://kubernetes.github.io/ingress-nginx &amp;&amp; helm repo update</w:t>
+        <w:t>helm repo add ingress-nginx https://kubernetes.github.io/ingress-nginx &amp;&amp; helm repo update</w:t>
       </w:r>
     </w:p>
     <w:p>
@@ -16526,25 +15556,7 @@
           <w:bCs/>
           <w:color w:val="0000FF"/>
         </w:rPr>
-        <w:t xml:space="preserve">helm repo </w:t>
-      </w:r>
-      <w:proofErr w:type="gramStart"/>
-      <w:r>
-        <w:rPr>
-          <w:b/>
-          <w:bCs/>
-          <w:color w:val="0000FF"/>
-        </w:rPr>
-        <w:t>add</w:t>
-      </w:r>
-      <w:proofErr w:type="gramEnd"/>
-      <w:r>
-        <w:rPr>
-          <w:b/>
-          <w:bCs/>
-          <w:color w:val="0000FF"/>
-        </w:rPr>
-        <w:t xml:space="preserve"> ingress-nginx https://kubernetes.github.io/ingress-nginx &amp;&amp; helm repo update</w:t>
+        <w:t>helm repo add ingress-nginx https://kubernetes.github.io/ingress-nginx &amp;&amp; helm repo update</w:t>
       </w:r>
     </w:p>
     <w:p>
@@ -18489,43 +17501,7 @@
           <w:bCs/>
           <w:color w:val="0000FF"/>
         </w:rPr>
-        <w:t xml:space="preserve"> --attach-policy-arn=</w:t>
-      </w:r>
-      <w:proofErr w:type="gramStart"/>
-      <w:r>
-        <w:rPr>
-          <w:b/>
-          <w:bCs/>
-          <w:color w:val="0000FF"/>
-        </w:rPr>
-        <w:t>arn:aws</w:t>
-      </w:r>
-      <w:proofErr w:type="gramEnd"/>
-      <w:r>
-        <w:rPr>
-          <w:b/>
-          <w:bCs/>
-          <w:color w:val="0000FF"/>
-        </w:rPr>
-        <w:t>:</w:t>
-      </w:r>
-      <w:proofErr w:type="gramStart"/>
-      <w:r>
-        <w:rPr>
-          <w:b/>
-          <w:bCs/>
-          <w:color w:val="0000FF"/>
-        </w:rPr>
-        <w:t>iam::727646499790:policy</w:t>
-      </w:r>
-      <w:proofErr w:type="gramEnd"/>
-      <w:r>
-        <w:rPr>
-          <w:b/>
-          <w:bCs/>
-          <w:color w:val="0000FF"/>
-        </w:rPr>
-        <w:t>/AWSLoadBalancerControllerIAMPolicy --approve --region us-east-1</w:t>
+        <w:t xml:space="preserve"> --attach-policy-arn=arn:aws:iam::727646499790:policy/AWSLoadBalancerControllerIAMPolicy --approve --region us-east-1</w:t>
       </w:r>
     </w:p>
     <w:p>
@@ -18655,25 +17631,7 @@
           <w:bCs/>
           <w:color w:val="0000FF"/>
         </w:rPr>
-        <w:t xml:space="preserve">helm repo </w:t>
-      </w:r>
-      <w:proofErr w:type="gramStart"/>
-      <w:r>
-        <w:rPr>
-          <w:b/>
-          <w:bCs/>
-          <w:color w:val="0000FF"/>
-        </w:rPr>
-        <w:t>add</w:t>
-      </w:r>
-      <w:proofErr w:type="gramEnd"/>
-      <w:r>
-        <w:rPr>
-          <w:b/>
-          <w:bCs/>
-          <w:color w:val="0000FF"/>
-        </w:rPr>
-        <w:t xml:space="preserve"> </w:t>
+        <w:t xml:space="preserve">helm repo add </w:t>
       </w:r>
       <w:proofErr w:type="spellStart"/>
       <w:r>
@@ -19613,25 +18571,7 @@
           <w:bCs/>
           <w:color w:val="0000FF"/>
         </w:rPr>
-        <w:t xml:space="preserve">    alb.ingress.kubernetes.io/listen-ports: '[{"HTTP":80</w:t>
-      </w:r>
-      <w:proofErr w:type="gramStart"/>
-      <w:r>
-        <w:rPr>
-          <w:b/>
-          <w:bCs/>
-          <w:color w:val="0000FF"/>
-        </w:rPr>
-        <w:t>},{</w:t>
-      </w:r>
-      <w:proofErr w:type="gramEnd"/>
-      <w:r>
-        <w:rPr>
-          <w:b/>
-          <w:bCs/>
-          <w:color w:val="0000FF"/>
-        </w:rPr>
-        <w:t>"HTTPS":443}]'</w:t>
+        <w:t xml:space="preserve">    alb.ingress.kubernetes.io/listen-ports: '[{"HTTP":80},{"HTTPS":443}]'</w:t>
       </w:r>
     </w:p>
     <w:p>
@@ -19667,43 +18607,7 @@
           <w:bCs/>
           <w:color w:val="0000FF"/>
         </w:rPr>
-        <w:t xml:space="preserve">: </w:t>
-      </w:r>
-      <w:proofErr w:type="gramStart"/>
-      <w:r>
-        <w:rPr>
-          <w:b/>
-          <w:bCs/>
-          <w:color w:val="0000FF"/>
-        </w:rPr>
-        <w:t>arn:aws</w:t>
-      </w:r>
-      <w:proofErr w:type="gramEnd"/>
-      <w:r>
-        <w:rPr>
-          <w:b/>
-          <w:bCs/>
-          <w:color w:val="0000FF"/>
-        </w:rPr>
-        <w:t>:acm:us-east-</w:t>
-      </w:r>
-      <w:proofErr w:type="gramStart"/>
-      <w:r>
-        <w:rPr>
-          <w:b/>
-          <w:bCs/>
-          <w:color w:val="0000FF"/>
-        </w:rPr>
-        <w:t>1:727646499790:certificate</w:t>
-      </w:r>
-      <w:proofErr w:type="gramEnd"/>
-      <w:r>
-        <w:rPr>
-          <w:b/>
-          <w:bCs/>
-          <w:color w:val="0000FF"/>
-        </w:rPr>
-        <w:t>/b747c427-d915-4115-bcfb-15ae3434999f</w:t>
+        <w:t>: arn:aws:acm:us-east-1:727646499790:certificate/b747c427-d915-4115-bcfb-15ae3434999f</w:t>
       </w:r>
     </w:p>
     <w:p>
@@ -24851,25 +23755,7 @@
           <w:bCs/>
           <w:color w:val="0000FF"/>
         </w:rPr>
-        <w:t>-security-</w:t>
-      </w:r>
-      <w:proofErr w:type="gramStart"/>
-      <w:r>
-        <w:rPr>
-          <w:b/>
-          <w:bCs/>
-          <w:color w:val="0000FF"/>
-        </w:rPr>
-        <w:t>app .</w:t>
-      </w:r>
-      <w:proofErr w:type="gramEnd"/>
-      <w:r>
-        <w:rPr>
-          <w:b/>
-          <w:bCs/>
-          <w:color w:val="0000FF"/>
-        </w:rPr>
-        <w:t>/</w:t>
+        <w:t>-security-app ./</w:t>
       </w:r>
       <w:proofErr w:type="spellStart"/>
       <w:r>
@@ -24961,37 +23847,17 @@
           <w:bCs/>
           <w:color w:val="0000FF"/>
         </w:rPr>
-        <w:t>enterprise-eks-security-</w:t>
-      </w:r>
-      <w:proofErr w:type="gramStart"/>
-      <w:r>
-        <w:rPr>
-          <w:b/>
-          <w:bCs/>
-          <w:color w:val="0000FF"/>
-        </w:rPr>
-        <w:t>app:latest</w:t>
-      </w:r>
-      <w:proofErr w:type="spellEnd"/>
-      <w:proofErr w:type="gramEnd"/>
-      <w:r>
-        <w:rPr>
-          <w:b/>
-          <w:bCs/>
-          <w:color w:val="0000FF"/>
-        </w:rPr>
-        <w:t xml:space="preserve"> 727646499790.dkr.ecr.us-east-1.amazonaws.com/enterprise-eks-security-</w:t>
-      </w:r>
-      <w:proofErr w:type="gramStart"/>
-      <w:r>
-        <w:rPr>
-          <w:b/>
-          <w:bCs/>
-          <w:color w:val="0000FF"/>
-        </w:rPr>
-        <w:t>app:latest</w:t>
-      </w:r>
-      <w:proofErr w:type="gramEnd"/>
+        <w:t>enterprise-eks-security-app:latest</w:t>
+      </w:r>
+      <w:proofErr w:type="spellEnd"/>
+      <w:r>
+        <w:rPr>
+          <w:b/>
+          <w:bCs/>
+          <w:color w:val="0000FF"/>
+        </w:rPr>
+        <w:t xml:space="preserve"> 727646499790.dkr.ecr.us-east-1.amazonaws.com/enterprise-eks-security-app:latest</w:t>
+      </w:r>
     </w:p>
     <w:p>
       <w:r>
@@ -25066,18 +23932,8 @@
           <w:bCs/>
           <w:color w:val="0000FF"/>
         </w:rPr>
-        <w:t>docker push 727646499790.dkr.ecr.us-east-1.amazonaws.com/enterprise-eks-security-</w:t>
-      </w:r>
-      <w:proofErr w:type="gramStart"/>
-      <w:r>
-        <w:rPr>
-          <w:b/>
-          <w:bCs/>
-          <w:color w:val="0000FF"/>
-        </w:rPr>
-        <w:t>app:latest</w:t>
-      </w:r>
-      <w:proofErr w:type="gramEnd"/>
+        <w:t>docker push 727646499790.dkr.ecr.us-east-1.amazonaws.com/enterprise-eks-security-app:latest</w:t>
+      </w:r>
     </w:p>
     <w:p>
       <w:r>
@@ -25234,12 +24090,10 @@
         <w:t xml:space="preserve">Update your </w:t>
       </w:r>
       <w:proofErr w:type="spellStart"/>
-      <w:proofErr w:type="gramStart"/>
       <w:r>
         <w:t>deployment.yaml</w:t>
       </w:r>
       <w:proofErr w:type="spellEnd"/>
-      <w:proofErr w:type="gramEnd"/>
     </w:p>
     <w:p>
       <w:pPr>
@@ -25824,18 +24678,8 @@
           <w:bCs/>
           <w:color w:val="0000FF"/>
         </w:rPr>
-        <w:t>          image: 727646499790.dkr.ecr.us-east-1.amazonaws.com/enterprise-eks-security-</w:t>
-      </w:r>
-      <w:proofErr w:type="gramStart"/>
-      <w:r>
-        <w:rPr>
-          <w:b/>
-          <w:bCs/>
-          <w:color w:val="0000FF"/>
-        </w:rPr>
-        <w:t>app:latest</w:t>
-      </w:r>
-      <w:proofErr w:type="gramEnd"/>
+        <w:t>          image: 727646499790.dkr.ecr.us-east-1.amazonaws.com/enterprise-eks-security-app:latest</w:t>
+      </w:r>
     </w:p>
     <w:p>
       <w:pPr>
@@ -26246,16 +25090,7 @@
           <w:bCs/>
           <w:color w:val="0000FF"/>
         </w:rPr>
-        <w:t xml:space="preserve"> -</w:t>
-      </w:r>
-      <w:proofErr w:type="gramStart"/>
-      <w:r>
-        <w:rPr>
-          <w:b/>
-          <w:bCs/>
-          <w:color w:val="0000FF"/>
-        </w:rPr>
-        <w:t>p .</w:t>
+        <w:t xml:space="preserve"> -p .</w:t>
       </w:r>
       <w:proofErr w:type="spellStart"/>
       <w:r>
@@ -26267,7 +25102,6 @@
         <w:t>github</w:t>
       </w:r>
       <w:proofErr w:type="spellEnd"/>
-      <w:proofErr w:type="gramEnd"/>
       <w:r>
         <w:rPr>
           <w:b/>
@@ -26745,61 +25579,25 @@
           <w:bCs/>
           <w:color w:val="0000FF"/>
         </w:rPr>
-        <w:t>-access-key-id: $</w:t>
-      </w:r>
-      <w:proofErr w:type="gramStart"/>
-      <w:r>
-        <w:rPr>
-          <w:b/>
-          <w:bCs/>
-          <w:color w:val="0000FF"/>
-        </w:rPr>
-        <w:t xml:space="preserve">{{ </w:t>
-      </w:r>
-      <w:proofErr w:type="spellStart"/>
-      <w:r>
-        <w:rPr>
-          <w:b/>
-          <w:bCs/>
-          <w:color w:val="0000FF"/>
-        </w:rPr>
-        <w:t>secrets.AWS</w:t>
-      </w:r>
-      <w:proofErr w:type="gramEnd"/>
-      <w:r>
-        <w:rPr>
-          <w:b/>
-          <w:bCs/>
-          <w:color w:val="0000FF"/>
-        </w:rPr>
-        <w:t>_ACCESS_KEY_</w:t>
-      </w:r>
-      <w:proofErr w:type="gramStart"/>
-      <w:r>
-        <w:rPr>
-          <w:b/>
-          <w:bCs/>
-          <w:color w:val="0000FF"/>
-        </w:rPr>
-        <w:t>ID</w:t>
-      </w:r>
-      <w:proofErr w:type="spellEnd"/>
-      <w:r>
-        <w:rPr>
-          <w:b/>
-          <w:bCs/>
-          <w:color w:val="0000FF"/>
-        </w:rPr>
-        <w:t xml:space="preserve"> }</w:t>
-      </w:r>
-      <w:proofErr w:type="gramEnd"/>
-      <w:r>
-        <w:rPr>
-          <w:b/>
-          <w:bCs/>
-          <w:color w:val="0000FF"/>
-        </w:rPr>
-        <w:t>}</w:t>
+        <w:t xml:space="preserve">-access-key-id: ${{ </w:t>
+      </w:r>
+      <w:proofErr w:type="spellStart"/>
+      <w:r>
+        <w:rPr>
+          <w:b/>
+          <w:bCs/>
+          <w:color w:val="0000FF"/>
+        </w:rPr>
+        <w:t>secrets.AWS_ACCESS_KEY_ID</w:t>
+      </w:r>
+      <w:proofErr w:type="spellEnd"/>
+      <w:r>
+        <w:rPr>
+          <w:b/>
+          <w:bCs/>
+          <w:color w:val="0000FF"/>
+        </w:rPr>
+        <w:t xml:space="preserve"> }}</w:t>
       </w:r>
     </w:p>
     <w:p>
@@ -26835,61 +25633,25 @@
           <w:bCs/>
           <w:color w:val="0000FF"/>
         </w:rPr>
-        <w:t>-secret-access-key: $</w:t>
-      </w:r>
-      <w:proofErr w:type="gramStart"/>
-      <w:r>
-        <w:rPr>
-          <w:b/>
-          <w:bCs/>
-          <w:color w:val="0000FF"/>
-        </w:rPr>
-        <w:t xml:space="preserve">{{ </w:t>
-      </w:r>
-      <w:proofErr w:type="spellStart"/>
-      <w:r>
-        <w:rPr>
-          <w:b/>
-          <w:bCs/>
-          <w:color w:val="0000FF"/>
-        </w:rPr>
-        <w:t>secrets.AWS</w:t>
-      </w:r>
-      <w:proofErr w:type="gramEnd"/>
-      <w:r>
-        <w:rPr>
-          <w:b/>
-          <w:bCs/>
-          <w:color w:val="0000FF"/>
-        </w:rPr>
-        <w:t>_SECRET_ACCESS_</w:t>
-      </w:r>
-      <w:proofErr w:type="gramStart"/>
-      <w:r>
-        <w:rPr>
-          <w:b/>
-          <w:bCs/>
-          <w:color w:val="0000FF"/>
-        </w:rPr>
-        <w:t>KEY</w:t>
-      </w:r>
-      <w:proofErr w:type="spellEnd"/>
-      <w:r>
-        <w:rPr>
-          <w:b/>
-          <w:bCs/>
-          <w:color w:val="0000FF"/>
-        </w:rPr>
-        <w:t xml:space="preserve"> }</w:t>
-      </w:r>
-      <w:proofErr w:type="gramEnd"/>
-      <w:r>
-        <w:rPr>
-          <w:b/>
-          <w:bCs/>
-          <w:color w:val="0000FF"/>
-        </w:rPr>
-        <w:t>}</w:t>
+        <w:t xml:space="preserve">-secret-access-key: ${{ </w:t>
+      </w:r>
+      <w:proofErr w:type="spellStart"/>
+      <w:r>
+        <w:rPr>
+          <w:b/>
+          <w:bCs/>
+          <w:color w:val="0000FF"/>
+        </w:rPr>
+        <w:t>secrets.AWS_SECRET_ACCESS_KEY</w:t>
+      </w:r>
+      <w:proofErr w:type="spellEnd"/>
+      <w:r>
+        <w:rPr>
+          <w:b/>
+          <w:bCs/>
+          <w:color w:val="0000FF"/>
+        </w:rPr>
+        <w:t xml:space="preserve"> }}</w:t>
       </w:r>
     </w:p>
     <w:p>
@@ -27017,25 +25779,7 @@
           <w:bCs/>
           <w:color w:val="0000FF"/>
         </w:rPr>
-        <w:t>-security-</w:t>
-      </w:r>
-      <w:proofErr w:type="gramStart"/>
-      <w:r>
-        <w:rPr>
-          <w:b/>
-          <w:bCs/>
-          <w:color w:val="0000FF"/>
-        </w:rPr>
-        <w:t>app .</w:t>
-      </w:r>
-      <w:proofErr w:type="gramEnd"/>
-      <w:r>
-        <w:rPr>
-          <w:b/>
-          <w:bCs/>
-          <w:color w:val="0000FF"/>
-        </w:rPr>
-        <w:t>/</w:t>
+        <w:t>-security-app ./</w:t>
       </w:r>
       <w:proofErr w:type="spellStart"/>
       <w:r>
@@ -27100,37 +25844,17 @@
           <w:bCs/>
           <w:color w:val="0000FF"/>
         </w:rPr>
-        <w:t>enterprise-eks-security-</w:t>
-      </w:r>
-      <w:proofErr w:type="gramStart"/>
-      <w:r>
-        <w:rPr>
-          <w:b/>
-          <w:bCs/>
-          <w:color w:val="0000FF"/>
-        </w:rPr>
-        <w:t>app:latest</w:t>
-      </w:r>
-      <w:proofErr w:type="spellEnd"/>
-      <w:proofErr w:type="gramEnd"/>
-      <w:r>
-        <w:rPr>
-          <w:b/>
-          <w:bCs/>
-          <w:color w:val="0000FF"/>
-        </w:rPr>
-        <w:t xml:space="preserve"> 727646499790.dkr.ecr.us-east-1.amazonaws.com/enterprise-eks-security-</w:t>
-      </w:r>
-      <w:proofErr w:type="gramStart"/>
-      <w:r>
-        <w:rPr>
-          <w:b/>
-          <w:bCs/>
-          <w:color w:val="0000FF"/>
-        </w:rPr>
-        <w:t>app:latest</w:t>
-      </w:r>
-      <w:proofErr w:type="gramEnd"/>
+        <w:t>enterprise-eks-security-app:latest</w:t>
+      </w:r>
+      <w:proofErr w:type="spellEnd"/>
+      <w:r>
+        <w:rPr>
+          <w:b/>
+          <w:bCs/>
+          <w:color w:val="0000FF"/>
+        </w:rPr>
+        <w:t xml:space="preserve"> 727646499790.dkr.ecr.us-east-1.amazonaws.com/enterprise-eks-security-app:latest</w:t>
+      </w:r>
     </w:p>
     <w:p>
       <w:pPr>
@@ -27175,18 +25899,8 @@
           <w:bCs/>
           <w:color w:val="0000FF"/>
         </w:rPr>
-        <w:t xml:space="preserve">        run: docker push 727646499790.dkr.ecr.us-east-1.amazonaws.com/enterprise-eks-security-</w:t>
-      </w:r>
-      <w:proofErr w:type="gramStart"/>
-      <w:r>
-        <w:rPr>
-          <w:b/>
-          <w:bCs/>
-          <w:color w:val="0000FF"/>
-        </w:rPr>
-        <w:t>app:latest</w:t>
-      </w:r>
-      <w:proofErr w:type="gramEnd"/>
+        <w:t xml:space="preserve">        run: docker push 727646499790.dkr.ecr.us-east-1.amazonaws.com/enterprise-eks-security-app:latest</w:t>
+      </w:r>
     </w:p>
     <w:p>
       <w:pPr>
@@ -27869,7 +26583,6 @@
       <w:r>
         <w:t xml:space="preserve">Leave as is:  </w:t>
       </w:r>
-      <w:proofErr w:type="gramStart"/>
       <w:r>
         <w:rPr>
           <w:b/>
@@ -27888,7 +26601,6 @@
         <w:t>gitignore</w:t>
       </w:r>
       <w:proofErr w:type="spellEnd"/>
-      <w:proofErr w:type="gramEnd"/>
     </w:p>
     <w:p>
       <w:pPr>
@@ -27940,82 +26652,7 @@
         <w:t>Create repository</w:t>
       </w:r>
     </w:p>
-    <w:p>
-      <w:r>
-        <w:pict w14:anchorId="0CD7D317">
-          <v:rect id="_x0000_i1279" style="width:0;height:1.5pt" o:hralign="center" o:hrstd="t" o:hr="t" fillcolor="#a0a0a0" stroked="f"/>
-        </w:pict>
-      </w:r>
-    </w:p>
-    <w:p>
-      <w:pPr>
-        <w:pStyle w:val="Heading1"/>
-      </w:pPr>
-      <w:r>
-        <w:t>Step 8</w:t>
-      </w:r>
-      <w:r>
-        <w:t>9</w:t>
-      </w:r>
-      <w:r>
-        <w:t xml:space="preserve">: </w:t>
-      </w:r>
-    </w:p>
-    <w:p>
-      <w:pPr>
-        <w:pStyle w:val="ListParagraph"/>
-      </w:pPr>
-    </w:p>
-    <w:p>
-      <w:pPr>
-        <w:pStyle w:val="ListParagraph"/>
-        <w:numPr>
-          <w:ilvl w:val="0"/>
-          <w:numId w:val="1"/>
-        </w:numPr>
-      </w:pPr>
-      <w:r>
-        <w:t xml:space="preserve"> </w:t>
-      </w:r>
-    </w:p>
-    <w:p>
-      <w:r>
-        <w:pict w14:anchorId="300ED6F8">
-          <v:rect id="_x0000_i1282" style="width:0;height:1.5pt" o:hralign="center" o:hrstd="t" o:hr="t" fillcolor="#a0a0a0" stroked="f"/>
-        </w:pict>
-      </w:r>
-    </w:p>
-    <w:p>
-      <w:pPr>
-        <w:pStyle w:val="Heading1"/>
-      </w:pPr>
-      <w:r>
-        <w:t xml:space="preserve">Step </w:t>
-      </w:r>
-      <w:r>
-        <w:t>90</w:t>
-      </w:r>
-      <w:r>
-        <w:t xml:space="preserve">: </w:t>
-      </w:r>
-    </w:p>
-    <w:p>
-      <w:pPr>
-        <w:pStyle w:val="ListParagraph"/>
-      </w:pPr>
-    </w:p>
-    <w:p>
-      <w:pPr>
-        <w:pStyle w:val="ListParagraph"/>
-        <w:numPr>
-          <w:ilvl w:val="0"/>
-          <w:numId w:val="1"/>
-        </w:numPr>
-      </w:pPr>
-      <w:r>
-        <w:t xml:space="preserve"> </w:t>
-      </w:r>
-    </w:p>
+    <w:p/>
     <w:p/>
     <w:p/>
     <w:p/>

</xml_diff>